<commit_message>
feat: add IACPN hit angle constraints with range gate (v2.1)
- New Params fields: hit_gamma_v (deg), hit_gamma_h (deg), hit_angle_range (km)
- Both angle axes are independently optional (None = unconstrained)
- hit_angle_range gates the angle law: pure PN outside, IACPN inside
- simulate.py: computes 3-D range-to-target each step and passes angles
  to guidance only when within the activation range
- guidance.py: IACPN docstring updated (from previous session)
- run.py: example parameters updated to show new fields
- simulation.ipynb: params cell updated; Section 13 added with comparison table
- Booster_Impact_Simulation_Documentation.docx: bumped to v2.1, added
  Section 6.6 (IACPN), range-gate step in Algorithm, v2.1 version history entry
</commit_message>
<xml_diff>
--- a/files/Booster_Impact_Simulation_Documentation.docx
+++ b/files/Booster_Impact_Simulation_Documentation.docx
@@ -36,7 +36,7 @@
           <w:color w:val="828282"/>
           <w:sz w:val="22"/>
         </w:rPr>
-        <w:t>Version 2.0 — April 02, 2026</w:t>
+        <w:t>Version 2.1 — April 04, 2026</w:t>
       </w:r>
     </w:p>
     <w:p/>
@@ -244,6 +244,80 @@
       </w:r>
     </w:p>
     <w:p>
+      <w:pPr/>
+      <w:r>
+        <w:t xml:space="preserve">   6.6  Impact Angle Constraints (IACPN — New in v2.1)</w:t>
+      </w:r>
+    </w:p>
+    <w:p>
+      <w:pPr/>
+      <w:r>
+        <w:t>where K = 2.0 is the angle gain and tgo = max(range / Vc, 1.0 s). Both corrections are summed with the PN command; the resultant is saturated to a_lat_max.</w:t>
+      </w:r>
+    </w:p>
+    <w:p>
+      <w:pPr/>
+      <w:r>
+        <w:t xml:space="preserve">    a_nH_angle = K · v · cos(γV) · sin(hit_γH − γH_LOS) / tgo</w:t>
+      </w:r>
+    </w:p>
+    <w:p>
+      <w:pPr/>
+      <w:r>
+        <w:t xml:space="preserve">    a_nV_angle = K · v · sin(hit_γV − γV_LOS) / tgo</w:t>
+      </w:r>
+    </w:p>
+    <w:p>
+      <w:pPr/>
+      <w:r>
+        <w:t>Mechanism: under pure PN the booster arrives approximately along the instantaneous LOS direction. The IACPN correction drives the difference between the desired angle and the LOS angle to zero with a tgo-weighted command:</w:t>
+      </w:r>
+    </w:p>
+    <w:p>
+      <w:pPr>
+        <w:pStyle w:val="ListBullet"/>
+      </w:pPr>
+      <w:r>
+        <w:t>hit_angle_range (km | None) — Range from the target at which the angle correction is activated. Outside this radius the law reduces to standard PN (minimising miss distance). Inside it the IACPN term is added, trading some accuracy for angle compliance. Set to None to keep the angle law active throughout the entire post-burnout flight.</w:t>
+      </w:r>
+    </w:p>
+    <w:p>
+      <w:pPr>
+        <w:pStyle w:val="ListBullet"/>
+      </w:pPr>
+      <w:r>
+        <w:t>hit_gamma_h (deg | None) — Desired impact azimuth γH at the target (0 = North, 90 = East, same convention as launch_azimuth). Set to None to leave the horizontal angle unconstrained.</w:t>
+      </w:r>
+    </w:p>
+    <w:p>
+      <w:pPr>
+        <w:pStyle w:val="ListBullet"/>
+      </w:pPr>
+      <w:r>
+        <w:t>hit_gamma_v (deg | None) — Desired impact flight-path angle γV at the target. Negative = descending (e.g. −60° = 60° below horizontal; −90° = vertical dive). Set to None to leave the vertical angle unconstrained.</w:t>
+      </w:r>
+    </w:p>
+    <w:p>
+      <w:pPr/>
+      <w:r>
+        <w:t>New input parameters:</w:t>
+      </w:r>
+    </w:p>
+    <w:p>
+      <w:pPr/>
+      <w:r>
+        <w:t>The IACPN (Impact Angle Constrained Proportional Navigation) law adds two optional terminal angle constraints on top of standard PN. When enabled, the guidance biases the lateral acceleration commands so that the booster arrives at the target along a prescribed approach direction in both the vertical (pitch) and horizontal (yaw) planes.</w:t>
+      </w:r>
+    </w:p>
+    <w:p>
+      <w:pPr>
+        <w:pStyle w:val="Heading2"/>
+      </w:pPr>
+      <w:r>
+        <w:t>6.6 Impact Angle Constraints (IACPN — New in v2.1)</w:t>
+      </w:r>
+    </w:p>
+    <w:p>
       <w:pPr>
         <w:spacing w:after="40"/>
         <w:ind w:left="0"/>
@@ -304,6 +378,12 @@
       </w:pPr>
       <w:r>
         <w:t>13. Version History</w:t>
+      </w:r>
+    </w:p>
+    <w:p>
+      <w:pPr/>
+      <w:r>
+        <w:t>v2.1 (April 2026) — Added IACPN impact angle constraints: hit_gamma_v and hit_gamma_h specify desired terminal flight-path and azimuth angles; hit_angle_range (km) is a range gate that activates the angle law only within a specified distance of the target. Pure PN is used outside the gate; IACPN correction is applied inside. Both angle axes are independently optional (None = unconstrained).</w:t>
       </w:r>
     </w:p>
     <w:p>
@@ -4662,6 +4742,14 @@
     <w:p>
       <w:pPr>
         <w:pStyle w:val="ListBullet"/>
+      </w:pPr>
+      <w:r>
+        <w:t>7. If post-burnout and angle constraints are set: compute 3-D range to target. If range ≤ hit_angle_range (or hit_angle_range is None), activate the IACPN correction and add it to the PN lateral command. Otherwise use pure PN.</w:t>
+      </w:r>
+    </w:p>
+    <w:p>
+      <w:pPr>
+        <w:pStyle w:val="ListBullet"/>
         <w:spacing w:after="40"/>
       </w:pPr>
       <w:r>
@@ -6538,7 +6626,7 @@
           <w:color w:val="969696"/>
           <w:sz w:val="18"/>
         </w:rPr>
-        <w:t>Satellite Launcher — Booster Impact Tracker  |  Technical Documentation v2.0  |  April 2026</w:t>
+        <w:t>Satellite Launcher — Booster Impact Tracker  |  Technical Documentation v2.1  |  April 2026</w:t>
       </w:r>
     </w:p>
     <w:sectPr>

</xml_diff>

<commit_message>
docs: sync notebook + docx to guidance-from-launch behaviour
- notebook: fix changelog in title cell (v2.1 correct description)
- docx: update algorithm step 7 and Section 6.6 to reflect yaw-only
  during burn + full PN+IACPN post-burnout; update v2.1 history entry
</commit_message>
<xml_diff>
--- a/files/Booster_Impact_Simulation_Documentation.docx
+++ b/files/Booster_Impact_Simulation_Documentation.docx
@@ -306,7 +306,7 @@
     <w:p>
       <w:pPr/>
       <w:r>
-        <w:t>The IACPN (Impact Angle Constrained Proportional Navigation) law adds two optional terminal angle constraints on top of standard PN. When enabled, the guidance biases the lateral acceleration commands so that the booster arrives at the target along a prescribed approach direction in both the vertical (pitch) and horizontal (yaw) planes.</w:t>
+        <w:t>The IACPN (Impact Angle Constrained Proportional Navigation) law adds two optional terminal angle constraints on top of standard PN. When enabled, guidance is active from launch (yaw-only during burn, full PN+IACPN after burnout). The IACPN correction biases the post-burnout lateral acceleration commands so that the booster arrives at the target along a prescribed approach direction in both the vertical (pitch) and horizontal (yaw) planes.</w:t>
       </w:r>
     </w:p>
     <w:p>
@@ -383,7 +383,7 @@
     <w:p>
       <w:pPr/>
       <w:r>
-        <w:t>v2.1 (April 2026) — Added IACPN impact angle constraints: hit_gamma_v and hit_gamma_h specify desired terminal flight-path and azimuth angles; hit_angle_range (km) is a range gate that activates the angle law only within a specified distance of the target. Pure PN is used outside the gate; IACPN correction is applied inside. Both angle axes are independently optional (None = unconstrained).</w:t>
+        <w:t>v2.1 (April 2026) — Added IACPN impact angle constraints: hit_gamma_v and hit_gamma_h specify desired terminal flight-path and azimuth angles; hit_angle_range (km) gates the angle correction near the target. Guidance now active from launch: yaw channel (a_nH) only during burn to correct heading without fighting the gravity turn; full PN+IACPN on both channels after burnout.</w:t>
       </w:r>
     </w:p>
     <w:p>
@@ -4744,7 +4744,7 @@
         <w:pStyle w:val="ListBullet"/>
       </w:pPr>
       <w:r>
-        <w:t>7. If post-burnout and angle constraints are set: compute 3-D range to target. If range ≤ hit_angle_range (or hit_angle_range is None), activate the IACPN correction and add it to the PN lateral command. Otherwise use pure PN.</w:t>
+        <w:t>7. Guidance is active from launch. During burn: yaw channel only (a_nH) corrects heading toward target; pitch (a_nV) is left to the gravity turn. After burnout: full PN on both channels. If angle constraints are set: compute 3-D range to target. If range ≤ hit_angle_range (or hit_angle_range is None), add IACPN correction to the PN command.</w:t>
       </w:r>
     </w:p>
     <w:p>

</xml_diff>

<commit_message>
Add open-loop trajectory optimiser (sim/opt_trajectory.py)
New module: sim/opt_trajectory.py
- sim_open_loop(): forward sim driven by piecewise-linear (a_nV, a_nH)
  schedule instead of a guidance law
- optimize_trajectory(): L-BFGS-B optimiser (optional DE global search)
  minimises J = w_miss*miss² + w_angle_v*γV_err² + w_angle_h*γH_err²
  + w_time*t_f, subject to lateral acceleration limit
- plot_optimised(): 4-panel comparison plot vs nominal IACPN

simulation.ipynb: Section 16 added (basic + angle-constrained demos)
docs: Section 16 added to Word documentation

Co-Authored-By: Claude Sonnet 4.6 <noreply@anthropic.com>
</commit_message>
<xml_diff>
--- a/files/Booster_Impact_Simulation_Documentation.docx
+++ b/files/Booster_Impact_Simulation_Documentation.docx
@@ -6629,6 +6629,560 @@
         <w:t>Satellite Launcher — Booster Impact Tracker  |  Technical Documentation v2.1  |  April 2026</w:t>
       </w:r>
     </w:p>
+    <w:p>
+      <w:pPr>
+        <w:pStyle w:val="Heading1"/>
+      </w:pPr>
+      <w:r>
+        <w:t>16  Open-Loop Trajectory Optimiser</w:t>
+      </w:r>
+    </w:p>
+    <w:p>
+      <w:pPr>
+        <w:pStyle w:val="Heading2"/>
+      </w:pPr>
+      <w:r>
+        <w:t>Overview</w:t>
+      </w:r>
+    </w:p>
+    <w:p>
+      <w:r>
+        <w:t>The module sim/opt_trajectory.py provides an open-loop trajectory optimiser that finds the lateral acceleration schedule (a_nV(t), a_nH(t)) minimising a merit function over the full flight — without using any guidance law. Commands are represented as N piecewise-linear knot points in time and injected directly into the equations of motion.</w:t>
+      </w:r>
+    </w:p>
+    <w:p>
+      <w:pPr>
+        <w:pStyle w:val="Heading2"/>
+      </w:pPr>
+      <w:r>
+        <w:t>Merit Function</w:t>
+      </w:r>
+    </w:p>
+    <w:p>
+      <w:r>
+        <w:t>J = w_miss · miss_m²  +  w_angle_v · γV_err_deg²  (only when hit_gamma_v is set)  +  w_angle_h · γH_err_deg²  (only when hit_gamma_h is set)  +  w_time · t_flight_s</w:t>
+      </w:r>
+    </w:p>
+    <w:p>
+      <w:pPr>
+        <w:pStyle w:val="NoSpacing"/>
+      </w:pPr>
+      <w:r>
+        <w:t>Priority ordering via default weights:</w:t>
+        <w:br/>
+        <w:t xml:space="preserve">  w_miss    = 1.0        — primary: drives miss toward zero</w:t>
+        <w:br/>
+        <w:t xml:space="preserve">  w_angle_v = 0.01       — secondary: significant once miss &lt; 1 m</w:t>
+        <w:br/>
+        <w:t xml:space="preserve">  w_angle_h = 0.01       — secondary: significant once miss &lt; 1 m</w:t>
+        <w:br/>
+        <w:t xml:space="preserve">  w_time    = 1e-5       — tertiary: gentle nudge to shorter flights</w:t>
+      </w:r>
+    </w:p>
+    <w:p>
+      <w:pPr>
+        <w:pStyle w:val="Heading2"/>
+      </w:pPr>
+      <w:r>
+        <w:t>Constraint</w:t>
+      </w:r>
+    </w:p>
+    <w:p>
+      <w:r>
+        <w:t>sqrt(a_nV² + a_nH²) ≤ a_max_g · G0  at every knot point.</w:t>
+        <w:br/>
+        <w:t>The physical actuator limit (params.a_lat_max) is additionally enforced at every integration step inside sim_open_loop().</w:t>
+      </w:r>
+    </w:p>
+    <w:p>
+      <w:pPr>
+        <w:pStyle w:val="Heading2"/>
+      </w:pPr>
+      <w:r>
+        <w:t>Public API</w:t>
+      </w:r>
+    </w:p>
+    <w:p>
+      <w:pPr>
+        <w:pStyle w:val="Heading3"/>
+      </w:pPr>
+      <w:r>
+        <w:t>sim_open_loop(params, t_knots, anV_knots, anH_knots, dt=0.2)</w:t>
+      </w:r>
+    </w:p>
+    <w:p>
+      <w:r>
+        <w:t>Forward simulation using a scheduled command sequence instead of a guidance law. Returns a dict with keys: miss_m, flight_time_s, final_state, series.</w:t>
+      </w:r>
+    </w:p>
+    <w:p>
+      <w:pPr>
+        <w:pStyle w:val="Heading3"/>
+      </w:pPr>
+      <w:r>
+        <w:t>optimize_trajectory(params, ...)</w:t>
+      </w:r>
+    </w:p>
+    <w:tbl>
+      <w:tblPr>
+        <w:tblStyle w:val="TableGrid"/>
+        <w:tblW w:type="auto" w:w="0"/>
+        <w:tblLook w:firstColumn="1" w:firstRow="1" w:lastColumn="0" w:lastRow="0" w:noHBand="0" w:noVBand="1" w:val="04A0"/>
+      </w:tblPr>
+      <w:tblGrid>
+        <w:gridCol w:w="3041"/>
+        <w:gridCol w:w="3041"/>
+        <w:gridCol w:w="3041"/>
+      </w:tblGrid>
+      <w:tr>
+        <w:tc>
+          <w:tcPr>
+            <w:tcW w:type="dxa" w:w="3041"/>
+          </w:tcPr>
+          <w:p>
+            <w:r>
+              <w:t>Parameter</w:t>
+            </w:r>
+          </w:p>
+        </w:tc>
+        <w:tc>
+          <w:tcPr>
+            <w:tcW w:type="dxa" w:w="3041"/>
+          </w:tcPr>
+          <w:p>
+            <w:r>
+              <w:t>Default</w:t>
+            </w:r>
+          </w:p>
+        </w:tc>
+        <w:tc>
+          <w:tcPr>
+            <w:tcW w:type="dxa" w:w="3041"/>
+          </w:tcPr>
+          <w:p>
+            <w:r>
+              <w:t>Description</w:t>
+            </w:r>
+          </w:p>
+        </w:tc>
+      </w:tr>
+      <w:tr>
+        <w:tc>
+          <w:tcPr>
+            <w:tcW w:type="dxa" w:w="3041"/>
+          </w:tcPr>
+          <w:p>
+            <w:r>
+              <w:t>n_knots</w:t>
+            </w:r>
+          </w:p>
+        </w:tc>
+        <w:tc>
+          <w:tcPr>
+            <w:tcW w:type="dxa" w:w="3041"/>
+          </w:tcPr>
+          <w:p>
+            <w:r>
+              <w:t>20</w:t>
+            </w:r>
+          </w:p>
+        </w:tc>
+        <w:tc>
+          <w:tcPr>
+            <w:tcW w:type="dxa" w:w="3041"/>
+          </w:tcPr>
+          <w:p>
+            <w:r>
+              <w:t>Number of piecewise-linear control knot points</w:t>
+            </w:r>
+          </w:p>
+        </w:tc>
+      </w:tr>
+      <w:tr>
+        <w:tc>
+          <w:tcPr>
+            <w:tcW w:type="dxa" w:w="3041"/>
+          </w:tcPr>
+          <w:p>
+            <w:r>
+              <w:t>a_max_g</w:t>
+            </w:r>
+          </w:p>
+        </w:tc>
+        <w:tc>
+          <w:tcPr>
+            <w:tcW w:type="dxa" w:w="3041"/>
+          </w:tcPr>
+          <w:p>
+            <w:r>
+              <w:t>a_lat_max</w:t>
+            </w:r>
+          </w:p>
+        </w:tc>
+        <w:tc>
+          <w:tcPr>
+            <w:tcW w:type="dxa" w:w="3041"/>
+          </w:tcPr>
+          <w:p>
+            <w:r>
+              <w:t>Optimiser lateral acceleration limit (g)</w:t>
+            </w:r>
+          </w:p>
+        </w:tc>
+      </w:tr>
+      <w:tr>
+        <w:tc>
+          <w:tcPr>
+            <w:tcW w:type="dxa" w:w="3041"/>
+          </w:tcPr>
+          <w:p>
+            <w:r>
+              <w:t>w_miss</w:t>
+            </w:r>
+          </w:p>
+        </w:tc>
+        <w:tc>
+          <w:tcPr>
+            <w:tcW w:type="dxa" w:w="3041"/>
+          </w:tcPr>
+          <w:p>
+            <w:r>
+              <w:t>1.0</w:t>
+            </w:r>
+          </w:p>
+        </w:tc>
+        <w:tc>
+          <w:tcPr>
+            <w:tcW w:type="dxa" w:w="3041"/>
+          </w:tcPr>
+          <w:p>
+            <w:r>
+              <w:t>Weight on miss² (per m²)</w:t>
+            </w:r>
+          </w:p>
+        </w:tc>
+      </w:tr>
+      <w:tr>
+        <w:tc>
+          <w:tcPr>
+            <w:tcW w:type="dxa" w:w="3041"/>
+          </w:tcPr>
+          <w:p>
+            <w:r>
+              <w:t>w_angle_v</w:t>
+            </w:r>
+          </w:p>
+        </w:tc>
+        <w:tc>
+          <w:tcPr>
+            <w:tcW w:type="dxa" w:w="3041"/>
+          </w:tcPr>
+          <w:p>
+            <w:r>
+              <w:t>0.01</w:t>
+            </w:r>
+          </w:p>
+        </w:tc>
+        <w:tc>
+          <w:tcPr>
+            <w:tcW w:type="dxa" w:w="3041"/>
+          </w:tcPr>
+          <w:p>
+            <w:r>
+              <w:t>Weight on γV error² (per deg²); active when hit_gamma_v set</w:t>
+            </w:r>
+          </w:p>
+        </w:tc>
+      </w:tr>
+      <w:tr>
+        <w:tc>
+          <w:tcPr>
+            <w:tcW w:type="dxa" w:w="3041"/>
+          </w:tcPr>
+          <w:p>
+            <w:r>
+              <w:t>w_angle_h</w:t>
+            </w:r>
+          </w:p>
+        </w:tc>
+        <w:tc>
+          <w:tcPr>
+            <w:tcW w:type="dxa" w:w="3041"/>
+          </w:tcPr>
+          <w:p>
+            <w:r>
+              <w:t>0.01</w:t>
+            </w:r>
+          </w:p>
+        </w:tc>
+        <w:tc>
+          <w:tcPr>
+            <w:tcW w:type="dxa" w:w="3041"/>
+          </w:tcPr>
+          <w:p>
+            <w:r>
+              <w:t>Weight on γH error² (per deg²); active when hit_gamma_h set</w:t>
+            </w:r>
+          </w:p>
+        </w:tc>
+      </w:tr>
+      <w:tr>
+        <w:tc>
+          <w:tcPr>
+            <w:tcW w:type="dxa" w:w="3041"/>
+          </w:tcPr>
+          <w:p>
+            <w:r>
+              <w:t>w_time</w:t>
+            </w:r>
+          </w:p>
+        </w:tc>
+        <w:tc>
+          <w:tcPr>
+            <w:tcW w:type="dxa" w:w="3041"/>
+          </w:tcPr>
+          <w:p>
+            <w:r>
+              <w:t>1e-5</w:t>
+            </w:r>
+          </w:p>
+        </w:tc>
+        <w:tc>
+          <w:tcPr>
+            <w:tcW w:type="dxa" w:w="3041"/>
+          </w:tcPr>
+          <w:p>
+            <w:r>
+              <w:t>Weight on flight time (per s)</w:t>
+            </w:r>
+          </w:p>
+        </w:tc>
+      </w:tr>
+      <w:tr>
+        <w:tc>
+          <w:tcPr>
+            <w:tcW w:type="dxa" w:w="3041"/>
+          </w:tcPr>
+          <w:p>
+            <w:r>
+              <w:t>method</w:t>
+            </w:r>
+          </w:p>
+        </w:tc>
+        <w:tc>
+          <w:tcPr>
+            <w:tcW w:type="dxa" w:w="3041"/>
+          </w:tcPr>
+          <w:p>
+            <w:r>
+              <w:t>L-BFGS-B</w:t>
+            </w:r>
+          </w:p>
+        </w:tc>
+        <w:tc>
+          <w:tcPr>
+            <w:tcW w:type="dxa" w:w="3041"/>
+          </w:tcPr>
+          <w:p>
+            <w:r>
+              <w:t>Scipy local optimiser: L-BFGS-B or SLSQP</w:t>
+            </w:r>
+          </w:p>
+        </w:tc>
+      </w:tr>
+      <w:tr>
+        <w:tc>
+          <w:tcPr>
+            <w:tcW w:type="dxa" w:w="3041"/>
+          </w:tcPr>
+          <w:p>
+            <w:r>
+              <w:t>max_iter</w:t>
+            </w:r>
+          </w:p>
+        </w:tc>
+        <w:tc>
+          <w:tcPr>
+            <w:tcW w:type="dxa" w:w="3041"/>
+          </w:tcPr>
+          <w:p>
+            <w:r>
+              <w:t>500</w:t>
+            </w:r>
+          </w:p>
+        </w:tc>
+        <w:tc>
+          <w:tcPr>
+            <w:tcW w:type="dxa" w:w="3041"/>
+          </w:tcPr>
+          <w:p>
+            <w:r>
+              <w:t>Maximum local-optimiser iterations</w:t>
+            </w:r>
+          </w:p>
+        </w:tc>
+      </w:tr>
+      <w:tr>
+        <w:tc>
+          <w:tcPr>
+            <w:tcW w:type="dxa" w:w="3041"/>
+          </w:tcPr>
+          <w:p>
+            <w:r>
+              <w:t>use_de</w:t>
+            </w:r>
+          </w:p>
+        </w:tc>
+        <w:tc>
+          <w:tcPr>
+            <w:tcW w:type="dxa" w:w="3041"/>
+          </w:tcPr>
+          <w:p>
+            <w:r>
+              <w:t>False</w:t>
+            </w:r>
+          </w:p>
+        </w:tc>
+        <w:tc>
+          <w:tcPr>
+            <w:tcW w:type="dxa" w:w="3041"/>
+          </w:tcPr>
+          <w:p>
+            <w:r>
+              <w:t>Run differential_evolution first for global warm start</w:t>
+            </w:r>
+          </w:p>
+        </w:tc>
+      </w:tr>
+      <w:tr>
+        <w:tc>
+          <w:tcPr>
+            <w:tcW w:type="dxa" w:w="3041"/>
+          </w:tcPr>
+          <w:p>
+            <w:r>
+              <w:t>verbose</w:t>
+            </w:r>
+          </w:p>
+        </w:tc>
+        <w:tc>
+          <w:tcPr>
+            <w:tcW w:type="dxa" w:w="3041"/>
+          </w:tcPr>
+          <w:p>
+            <w:r>
+              <w:t>True</w:t>
+            </w:r>
+          </w:p>
+        </w:tc>
+        <w:tc>
+          <w:tcPr>
+            <w:tcW w:type="dxa" w:w="3041"/>
+          </w:tcPr>
+          <w:p>
+            <w:r>
+              <w:t>Print progress to stdout</w:t>
+            </w:r>
+          </w:p>
+        </w:tc>
+      </w:tr>
+    </w:tbl>
+    <w:p/>
+    <w:p>
+      <w:r>
+        <w:t>Returns a dict with keys: summary (scalar comparison), schedule (knot times and commands in SI and g), series (full time-series), nominal (IACPN warm-start result).</w:t>
+      </w:r>
+    </w:p>
+    <w:p>
+      <w:pPr>
+        <w:pStyle w:val="Heading3"/>
+      </w:pPr>
+      <w:r>
+        <w:t>plot_optimised(result, title)</w:t>
+      </w:r>
+    </w:p>
+    <w:p>
+      <w:r>
+        <w:t>4-panel comparison plot showing nominal IACPN vs optimised trajectory: ground track, altitude vs time, a_nV vs time, a_nH vs time. Knot points are overlaid on the command panels.</w:t>
+      </w:r>
+    </w:p>
+    <w:p>
+      <w:pPr>
+        <w:pStyle w:val="Heading2"/>
+      </w:pPr>
+      <w:r>
+        <w:t>Implementation Notes</w:t>
+      </w:r>
+    </w:p>
+    <w:p>
+      <w:pPr>
+        <w:pStyle w:val="ListBullet"/>
+      </w:pPr>
+      <w:r>
+        <w:t>Warm start: a nominal IACPN run provides the initial guess for the command profile. This typically places the optimiser close to the basin of attraction.</w:t>
+      </w:r>
+    </w:p>
+    <w:p>
+      <w:pPr>
+        <w:pStyle w:val="ListBullet"/>
+      </w:pPr>
+      <w:r>
+        <w:t>Control normalisation: optimisation variables are scaled to [-1, 1] by a_max for better numerical conditioning.</w:t>
+      </w:r>
+    </w:p>
+    <w:p>
+      <w:pPr>
+        <w:pStyle w:val="ListBullet"/>
+      </w:pPr>
+      <w:r>
+        <w:t>Knot span: t_knots runs from 0 to 1.2 × t_f_nominal to allow minor flight-time overruns without extrapolation artifacts.</w:t>
+      </w:r>
+    </w:p>
+    <w:p>
+      <w:pPr>
+        <w:pStyle w:val="ListBullet"/>
+      </w:pPr>
+      <w:r>
+        <w:t>Termination: the simulation stops at the same conditions as simulate() (h ≤ z_target after passing above, or h ≤ 0).</w:t>
+      </w:r>
+    </w:p>
+    <w:p>
+      <w:pPr>
+        <w:pStyle w:val="ListBullet"/>
+      </w:pPr>
+      <w:r>
+        <w:t>No guidance law: the optimiser does not call lateral_accel_command(). The resulting command sequence may look quite different from the IACPN profile.</w:t>
+      </w:r>
+    </w:p>
+    <w:p>
+      <w:pPr>
+        <w:pStyle w:val="Heading2"/>
+      </w:pPr>
+      <w:r>
+        <w:t>Usage Example</w:t>
+      </w:r>
+    </w:p>
+    <w:p>
+      <w:pPr>
+        <w:pStyle w:val="NoSpacing"/>
+      </w:pPr>
+      <w:r>
+        <w:t>from sim.opt_trajectory import optimize_trajectory, plot_optimised</w:t>
+        <w:br/>
+        <w:t>result = optimize_trajectory(params, n_knots=20, a_max_g=3.0)</w:t>
+        <w:br/>
+        <w:t>print(result["summary"])</w:t>
+        <w:br/>
+        <w:t>plot_optimised(result)</w:t>
+        <w:br/>
+        <w:br/>
+        <w:t># With impact angle constraint</w:t>
+        <w:br/>
+        <w:t>p2 = replace(params, hit_gamma_v=-70.0)</w:t>
+        <w:br/>
+        <w:t>result2 = optimize_trajectory(p2, w_angle_v=0.01)</w:t>
+      </w:r>
+    </w:p>
     <w:sectPr>
       <w:pgSz w:w="12240" w:h="15840"/>
       <w:pgMar w:top="1417" w:right="1417" w:bottom="1417" w:left="1701" w:header="720" w:footer="720" w:gutter="0"/>

</xml_diff>

<commit_message>
Add simulation result plots to Word documentation
Three figures inserted into a new 'Simulation Result Plots' section:
- Fig 1: 7-panel simulation dashboard (nominal IACPN run)
- Fig 2: IACPN guidance comparison — ballistic vs pure PN vs angle-constrained
- Fig 3: Open-loop optimiser result — nominal vs optimised trajectory

All generated from the demo parameters (m_pay=50, x_target=10/10 km, a_lat_max=3g).

Co-Authored-By: Claude Sonnet 4.6 <noreply@anthropic.com>
</commit_message>
<xml_diff>
--- a/files/Booster_Impact_Simulation_Documentation.docx
+++ b/files/Booster_Impact_Simulation_Documentation.docx
@@ -7268,6 +7268,175 @@
         <w:t xml:space="preserve">  • use_de=True for global search across trajectory shapes</w:t>
       </w:r>
     </w:p>
+    <w:p>
+      <w:pPr>
+        <w:pStyle w:val="Heading1"/>
+      </w:pPr>
+      <w:r>
+        <w:t>Simulation Result Plots</w:t>
+      </w:r>
+    </w:p>
+    <w:p>
+      <w:r>
+        <w:t>The following plots were generated using the demo parameters: m_pay=50 kg, m_prop=495 kg, m_str=50 kg, Isp=260 s, thrust=31 kN, burn_max=20 s, cd=0.4, diam=0.5 m, launch_angle=45°, launch_azimuth=45°, x_target=10 km, y_target=10 km, a_lat_max=3.0 g.</w:t>
+      </w:r>
+    </w:p>
+    <w:p>
+      <w:pPr>
+        <w:jc w:val="center"/>
+      </w:pPr>
+      <w:r>
+        <w:drawing>
+          <wp:inline xmlns:a="http://schemas.openxmlformats.org/drawingml/2006/main" xmlns:pic="http://schemas.openxmlformats.org/drawingml/2006/picture">
+            <wp:extent cx="5669280" cy="4011189"/>
+            <wp:docPr id="1" name="Picture 1"/>
+            <wp:cNvGraphicFramePr>
+              <a:graphicFrameLocks noChangeAspect="1"/>
+            </wp:cNvGraphicFramePr>
+            <a:graphic>
+              <a:graphicData uri="http://schemas.openxmlformats.org/drawingml/2006/picture">
+                <pic:pic>
+                  <pic:nvPicPr>
+                    <pic:cNvPr id="0" name="_doc_fig1_dashboard.png"/>
+                    <pic:cNvPicPr/>
+                  </pic:nvPicPr>
+                  <pic:blipFill>
+                    <a:blip r:embed="rId9"/>
+                    <a:stretch>
+                      <a:fillRect/>
+                    </a:stretch>
+                  </pic:blipFill>
+                  <pic:spPr>
+                    <a:xfrm>
+                      <a:off x="0" y="0"/>
+                      <a:ext cx="5669280" cy="4011189"/>
+                    </a:xfrm>
+                    <a:prstGeom prst="rect"/>
+                  </pic:spPr>
+                </pic:pic>
+              </a:graphicData>
+            </a:graphic>
+          </wp:inline>
+        </w:drawing>
+      </w:r>
+    </w:p>
+    <w:p>
+      <w:pPr>
+        <w:jc w:val="center"/>
+      </w:pPr>
+      <w:r>
+        <w:rPr>
+          <w:i/>
+          <w:sz w:val="18"/>
+        </w:rPr>
+        <w:t>Figure 1 — Simulation dashboard: nominal IACPN run (target: x=10 km, y=10 km, a_lat_max=3.0 g). Miss distance: 2050.9 m, flight time: 30.4 s.</w:t>
+      </w:r>
+    </w:p>
+    <w:p/>
+    <w:p>
+      <w:pPr>
+        <w:jc w:val="center"/>
+      </w:pPr>
+      <w:r>
+        <w:drawing>
+          <wp:inline xmlns:a="http://schemas.openxmlformats.org/drawingml/2006/main" xmlns:pic="http://schemas.openxmlformats.org/drawingml/2006/picture">
+            <wp:extent cx="5669280" cy="1884874"/>
+            <wp:docPr id="2" name="Picture 2"/>
+            <wp:cNvGraphicFramePr>
+              <a:graphicFrameLocks noChangeAspect="1"/>
+            </wp:cNvGraphicFramePr>
+            <a:graphic>
+              <a:graphicData uri="http://schemas.openxmlformats.org/drawingml/2006/picture">
+                <pic:pic>
+                  <pic:nvPicPr>
+                    <pic:cNvPr id="0" name="_doc_fig2_iacpn.png"/>
+                    <pic:cNvPicPr/>
+                  </pic:nvPicPr>
+                  <pic:blipFill>
+                    <a:blip r:embed="rId10"/>
+                    <a:stretch>
+                      <a:fillRect/>
+                    </a:stretch>
+                  </pic:blipFill>
+                  <pic:spPr>
+                    <a:xfrm>
+                      <a:off x="0" y="0"/>
+                      <a:ext cx="5669280" cy="1884874"/>
+                    </a:xfrm>
+                    <a:prstGeom prst="rect"/>
+                  </pic:spPr>
+                </pic:pic>
+              </a:graphicData>
+            </a:graphic>
+          </wp:inline>
+        </w:drawing>
+      </w:r>
+    </w:p>
+    <w:p>
+      <w:pPr>
+        <w:jc w:val="center"/>
+      </w:pPr>
+      <w:r>
+        <w:rPr>
+          <w:i/>
+          <w:sz w:val="18"/>
+        </w:rPr>
+        <w:t>Figure 2 — IACPN guidance comparison. Four cases with the same vehicle: ballistic (no guidance), pure PN, and two IACPN configurations with γV = −45° impact angle constraint. Left: ground tracks; centre: altitude; right: flight-path angle showing the angle constraint effect.</w:t>
+      </w:r>
+    </w:p>
+    <w:p/>
+    <w:p>
+      <w:pPr>
+        <w:jc w:val="center"/>
+      </w:pPr>
+      <w:r>
+        <w:drawing>
+          <wp:inline xmlns:a="http://schemas.openxmlformats.org/drawingml/2006/main" xmlns:pic="http://schemas.openxmlformats.org/drawingml/2006/picture">
+            <wp:extent cx="5669280" cy="3896784"/>
+            <wp:docPr id="3" name="Picture 3"/>
+            <wp:cNvGraphicFramePr>
+              <a:graphicFrameLocks noChangeAspect="1"/>
+            </wp:cNvGraphicFramePr>
+            <a:graphic>
+              <a:graphicData uri="http://schemas.openxmlformats.org/drawingml/2006/picture">
+                <pic:pic>
+                  <pic:nvPicPr>
+                    <pic:cNvPr id="0" name="_doc_fig3_optimizer.png"/>
+                    <pic:cNvPicPr/>
+                  </pic:nvPicPr>
+                  <pic:blipFill>
+                    <a:blip r:embed="rId11"/>
+                    <a:stretch>
+                      <a:fillRect/>
+                    </a:stretch>
+                  </pic:blipFill>
+                  <pic:spPr>
+                    <a:xfrm>
+                      <a:off x="0" y="0"/>
+                      <a:ext cx="5669280" cy="3896784"/>
+                    </a:xfrm>
+                    <a:prstGeom prst="rect"/>
+                  </pic:spPr>
+                </pic:pic>
+              </a:graphicData>
+            </a:graphic>
+          </wp:inline>
+        </w:drawing>
+      </w:r>
+    </w:p>
+    <w:p>
+      <w:pPr>
+        <w:jc w:val="center"/>
+      </w:pPr>
+      <w:r>
+        <w:rPr>
+          <w:i/>
+          <w:sz w:val="18"/>
+        </w:rPr>
+        <w:t>Figure 3 — Open-loop trajectory optimiser result. Nominal IACPN miss: 2050.9 m → optimised miss: 0.83 m (solved: True). Bottom panels show the piecewise-linear command schedule (knot points in green) vs the nominal IACPN guidance commands.</w:t>
+      </w:r>
+    </w:p>
+    <w:p/>
     <w:sectPr>
       <w:pgSz w:w="12240" w:h="15840"/>
       <w:pgMar w:top="1417" w:right="1417" w:bottom="1417" w:left="1701" w:header="720" w:footer="720" w:gutter="0"/>

</xml_diff>

<commit_message>
Add optimise=True mode to run_grid (grid trajectory optimizer)
grid_run.py:
- New parameter: optimise=False — if True, every grid cell runs
  optimize_trajectory() instead of simulate()
- New parameter: opt_kwargs — dict forwarded to optimize_trajectory()
  (n_knots, a_max_g, w_miss, w_angle_v, w_time, method, max_iter, use_de)
- Normalized series/summary dicts in each run dict so plot_grid works
  identically for both IACPN and optimizer runs
- plot_grid updates: green/red bar colours for solved status, angle error
  annotations (ΔγV, ΔγH) above bars, desired γV dotted reference lines,
  1 m threshold line, extended summary table with solved/angle columns

Notebook: Section 17 added (optimizer grid — miss-only and angle-constrained)
Docs: Section 17 added

Co-Authored-By: Claude Sonnet 4.6 <noreply@anthropic.com>
</commit_message>
<xml_diff>
--- a/files/Booster_Impact_Simulation_Documentation.docx
+++ b/files/Booster_Impact_Simulation_Documentation.docx
@@ -7437,6 +7437,266 @@
       </w:r>
     </w:p>
     <w:p/>
+    <w:p>
+      <w:pPr>
+        <w:pStyle w:val="Heading1"/>
+      </w:pPr>
+      <w:r>
+        <w:t>17  Optimizer Grid Runner</w:t>
+      </w:r>
+    </w:p>
+    <w:p>
+      <w:pPr>
+        <w:pStyle w:val="Heading2"/>
+      </w:pPr>
+      <w:r>
+        <w:t>Overview</w:t>
+      </w:r>
+    </w:p>
+    <w:p>
+      <w:r>
+        <w:t>run_grid() now accepts optimise=True to run optimize_trajectory() for every cell in the hit_points × hit_angles Cartesian product, instead of the IACPN guidance simulation. All other behaviour (cross-product, plot_grid, summary table) is unchanged.</w:t>
+      </w:r>
+    </w:p>
+    <w:p>
+      <w:pPr>
+        <w:pStyle w:val="Heading2"/>
+      </w:pPr>
+      <w:r>
+        <w:t>API change</w:t>
+      </w:r>
+    </w:p>
+    <w:p>
+      <w:pPr>
+        <w:pStyle w:val="NoSpacing"/>
+      </w:pPr>
+      <w:r>
+        <w:t>run_grid(base_params, hit_points, hit_angles=None,</w:t>
+        <w:br/>
+        <w:t xml:space="preserve">         hit_angle_range=None,</w:t>
+        <w:br/>
+        <w:t xml:space="preserve">         optimise=False,</w:t>
+        <w:br/>
+        <w:t xml:space="preserve">         opt_kwargs=None)</w:t>
+      </w:r>
+    </w:p>
+    <w:tbl>
+      <w:tblPr>
+        <w:tblStyle w:val="TableGrid"/>
+        <w:tblW w:type="auto" w:w="0"/>
+        <w:tblLook w:firstColumn="1" w:firstRow="1" w:lastColumn="0" w:lastRow="0" w:noHBand="0" w:noVBand="1" w:val="04A0"/>
+      </w:tblPr>
+      <w:tblGrid>
+        <w:gridCol w:w="3041"/>
+        <w:gridCol w:w="3041"/>
+        <w:gridCol w:w="3041"/>
+      </w:tblGrid>
+      <w:tr>
+        <w:tc>
+          <w:tcPr>
+            <w:tcW w:type="dxa" w:w="3041"/>
+          </w:tcPr>
+          <w:p>
+            <w:r>
+              <w:t>Parameter</w:t>
+            </w:r>
+          </w:p>
+        </w:tc>
+        <w:tc>
+          <w:tcPr>
+            <w:tcW w:type="dxa" w:w="3041"/>
+          </w:tcPr>
+          <w:p>
+            <w:r>
+              <w:t>Default</w:t>
+            </w:r>
+          </w:p>
+        </w:tc>
+        <w:tc>
+          <w:tcPr>
+            <w:tcW w:type="dxa" w:w="3041"/>
+          </w:tcPr>
+          <w:p>
+            <w:r>
+              <w:t>Description</w:t>
+            </w:r>
+          </w:p>
+        </w:tc>
+      </w:tr>
+      <w:tr>
+        <w:tc>
+          <w:tcPr>
+            <w:tcW w:type="dxa" w:w="3041"/>
+          </w:tcPr>
+          <w:p>
+            <w:r>
+              <w:t>optimise</w:t>
+            </w:r>
+          </w:p>
+        </w:tc>
+        <w:tc>
+          <w:tcPr>
+            <w:tcW w:type="dxa" w:w="3041"/>
+          </w:tcPr>
+          <w:p>
+            <w:r>
+              <w:t>False</w:t>
+            </w:r>
+          </w:p>
+        </w:tc>
+        <w:tc>
+          <w:tcPr>
+            <w:tcW w:type="dxa" w:w="3041"/>
+          </w:tcPr>
+          <w:p>
+            <w:r>
+              <w:t>If True, use optimize_trajectory() for every run.</w:t>
+            </w:r>
+          </w:p>
+        </w:tc>
+      </w:tr>
+      <w:tr>
+        <w:tc>
+          <w:tcPr>
+            <w:tcW w:type="dxa" w:w="3041"/>
+          </w:tcPr>
+          <w:p>
+            <w:r>
+              <w:t>opt_kwargs</w:t>
+            </w:r>
+          </w:p>
+        </w:tc>
+        <w:tc>
+          <w:tcPr>
+            <w:tcW w:type="dxa" w:w="3041"/>
+          </w:tcPr>
+          <w:p>
+            <w:r>
+              <w:t>None</w:t>
+            </w:r>
+          </w:p>
+        </w:tc>
+        <w:tc>
+          <w:tcPr>
+            <w:tcW w:type="dxa" w:w="3041"/>
+          </w:tcPr>
+          <w:p>
+            <w:r>
+              <w:t>Dict of kwargs forwarded to optimize_trajectory() for each run. Common: n_knots, a_max_g, w_miss, w_angle_v, w_angle_h, w_time, method, max_iter, use_de. verbose defaults to False (quiet grid run).</w:t>
+            </w:r>
+          </w:p>
+        </w:tc>
+      </w:tr>
+    </w:tbl>
+    <w:p>
+      <w:pPr>
+        <w:pStyle w:val="Heading2"/>
+      </w:pPr>
+      <w:r>
+        <w:t>Run dict — new keys</w:t>
+      </w:r>
+    </w:p>
+    <w:p>
+      <w:pPr>
+        <w:pStyle w:val="NoSpacing"/>
+      </w:pPr>
+      <w:r>
+        <w:t>Each run dict now contains:</w:t>
+        <w:br/>
+        <w:t xml:space="preserve">  optimised   — bool, True when optimizer was used</w:t>
+        <w:br/>
+        <w:t xml:space="preserve">  series      — normalised time-series (unified key names for both modes)</w:t>
+        <w:br/>
+        <w:t xml:space="preserve">  summary     — normalised summary with:  miss_m, flight_time_s,</w:t>
+        <w:br/>
+        <w:t xml:space="preserve">                final_gamma_v_deg, final_gamma_h_deg, impact_range_km,</w:t>
+        <w:br/>
+        <w:t xml:space="preserve">                solved (True/False/None), gamma_v_err_deg, gamma_h_err_deg</w:t>
+      </w:r>
+    </w:p>
+    <w:p>
+      <w:pPr>
+        <w:pStyle w:val="Heading2"/>
+      </w:pPr>
+      <w:r>
+        <w:t>plot_grid updates</w:t>
+      </w:r>
+    </w:p>
+    <w:p>
+      <w:pPr>
+        <w:pStyle w:val="ListBullet"/>
+      </w:pPr>
+      <w:r>
+        <w:t>Bar chart colour: green = solved (miss &lt; 1 m), red = not solved, tab colour = IACPN run (solved not applicable).</w:t>
+      </w:r>
+    </w:p>
+    <w:p>
+      <w:pPr>
+        <w:pStyle w:val="ListBullet"/>
+      </w:pPr>
+      <w:r>
+        <w:t>Angle error annotations (ΔγV, ΔγH) shown above each bar when available.</w:t>
+      </w:r>
+    </w:p>
+    <w:p>
+      <w:pPr>
+        <w:pStyle w:val="ListBullet"/>
+      </w:pPr>
+      <w:r>
+        <w:t>1 m threshold dashed line added to bar chart for optimised runs.</w:t>
+      </w:r>
+    </w:p>
+    <w:p>
+      <w:pPr>
+        <w:pStyle w:val="ListBullet"/>
+      </w:pPr>
+      <w:r>
+        <w:t>Desired γV reference lines (dotted) drawn on γV panel for each unique hit_gamma_v value in the grid.</w:t>
+      </w:r>
+    </w:p>
+    <w:p>
+      <w:pPr>
+        <w:pStyle w:val="ListBullet"/>
+      </w:pPr>
+      <w:r>
+        <w:t>Summary table extended with solved, ΔγV, ΔγH columns for optimised runs.</w:t>
+      </w:r>
+    </w:p>
+    <w:p>
+      <w:pPr>
+        <w:pStyle w:val="Heading2"/>
+      </w:pPr>
+      <w:r>
+        <w:t>Usage example</w:t>
+      </w:r>
+    </w:p>
+    <w:p>
+      <w:pPr>
+        <w:pStyle w:val="NoSpacing"/>
+      </w:pPr>
+      <w:r>
+        <w:t>from grid_run import run_grid, plot_grid</w:t>
+        <w:br/>
+        <w:br/>
+        <w:t># IACPN grid (original)</w:t>
+        <w:br/>
+        <w:t>runs_sim = run_grid(base, hit_points, hit_angles=hit_angles)</w:t>
+        <w:br/>
+        <w:br/>
+        <w:t># Optimizer grid</w:t>
+        <w:br/>
+        <w:t>runs_opt = run_grid(base, hit_points, hit_angles=hit_angles,</w:t>
+        <w:br/>
+        <w:t xml:space="preserve">                    optimise=True,</w:t>
+        <w:br/>
+        <w:t xml:space="preserve">                    opt_kwargs=dict(n_knots=20, a_max_g=3.0,</w:t>
+        <w:br/>
+        <w:t xml:space="preserve">                                    w_angle_v=0.01, max_iter=400))</w:t>
+        <w:br/>
+        <w:br/>
+        <w:t>plot_grid(runs_opt, title="Optimizer grid")</w:t>
+      </w:r>
+    </w:p>
     <w:sectPr>
       <w:pgSz w:w="12240" w:h="15840"/>
       <w:pgMar w:top="1417" w:right="1417" w:bottom="1417" w:left="1701" w:header="720" w:footer="720" w:gutter="0"/>

</xml_diff>

<commit_message>
docs: update Figure 1 to optimizer result (miss=0.83 m), add grid optimizer plots
- Figure 1 replaced: optimizer 4-panel showing IACPN 2050 m → optimised 0.83 m (solved)
- Figure 4: optimizer grid (no angle) — 3 target points, green/red bars for solved status
- Figure 5: optimizer grid (angle-constrained) — 4 cases (γV=−45° and −70°), ΔγV annotations

Co-Authored-By: Claude Sonnet 4.6 <noreply@anthropic.com>
</commit_message>
<xml_diff>
--- a/files/Booster_Impact_Simulation_Documentation.docx
+++ b/files/Booster_Impact_Simulation_Documentation.docx
@@ -7288,8 +7288,8 @@
       <w:r>
         <w:drawing>
           <wp:inline xmlns:a="http://schemas.openxmlformats.org/drawingml/2006/main" xmlns:pic="http://schemas.openxmlformats.org/drawingml/2006/picture">
-            <wp:extent cx="5669280" cy="4011189"/>
-            <wp:docPr id="1" name="Picture 1"/>
+            <wp:extent cx="5669280" cy="3896784"/>
+            <wp:docPr id="4" name="Picture 4"/>
             <wp:cNvGraphicFramePr>
               <a:graphicFrameLocks noChangeAspect="1"/>
             </wp:cNvGraphicFramePr>
@@ -7297,11 +7297,11 @@
               <a:graphicData uri="http://schemas.openxmlformats.org/drawingml/2006/picture">
                 <pic:pic>
                   <pic:nvPicPr>
-                    <pic:cNvPr id="0" name="_doc_fig1_dashboard.png"/>
+                    <pic:cNvPr id="0" name="fig1_optimizer.png"/>
                     <pic:cNvPicPr/>
                   </pic:nvPicPr>
                   <pic:blipFill>
-                    <a:blip r:embed="rId9"/>
+                    <a:blip r:embed="rId12"/>
                     <a:stretch>
                       <a:fillRect/>
                     </a:stretch>
@@ -7309,7 +7309,7 @@
                   <pic:spPr>
                     <a:xfrm>
                       <a:off x="0" y="0"/>
-                      <a:ext cx="5669280" cy="4011189"/>
+                      <a:ext cx="5669280" cy="3896784"/>
                     </a:xfrm>
                     <a:prstGeom prst="rect"/>
                   </pic:spPr>
@@ -7325,11 +7325,7 @@
         <w:jc w:val="center"/>
       </w:pPr>
       <w:r>
-        <w:rPr>
-          <w:i/>
-          <w:sz w:val="18"/>
-        </w:rPr>
-        <w:t>Figure 1 — Simulation dashboard: nominal IACPN run (target: x=10 km, y=10 km, a_lat_max=3.0 g). Miss distance: 2050.9 m, flight time: 30.4 s.</w:t>
+        <w:t>Figure 1 — Open-loop trajectory optimiser: (10 km N, 10 km E) target, no angle constraint. Nominal IACPN miss: 2051 m → optimised miss: 0.83 m (solved: True). Optimised flight time: 46.2 s.</w:t>
       </w:r>
     </w:p>
     <w:p/>
@@ -7695,6 +7691,107 @@
         <w:br/>
         <w:br/>
         <w:t>plot_grid(runs_opt, title="Optimizer grid")</w:t>
+      </w:r>
+    </w:p>
+    <w:p>
+      <w:pPr>
+        <w:pStyle w:val="Heading2"/>
+      </w:pPr>
+      <w:r>
+        <w:t>Optimizer Grid — Result Plots</w:t>
+      </w:r>
+    </w:p>
+    <w:p>
+      <w:r>
+        <w:t>The following plots were generated by running optimize_trajectory() for each cell in the hit_points × hit_angles Cartesian product using the demo vehicle parameters.</w:t>
+      </w:r>
+    </w:p>
+    <w:p>
+      <w:pPr>
+        <w:jc w:val="center"/>
+      </w:pPr>
+      <w:r>
+        <w:drawing>
+          <wp:inline xmlns:a="http://schemas.openxmlformats.org/drawingml/2006/main" xmlns:pic="http://schemas.openxmlformats.org/drawingml/2006/picture">
+            <wp:extent cx="5669280" cy="3752056"/>
+            <wp:docPr id="5" name="Picture 5"/>
+            <wp:cNvGraphicFramePr>
+              <a:graphicFrameLocks noChangeAspect="1"/>
+            </wp:cNvGraphicFramePr>
+            <a:graphic>
+              <a:graphicData uri="http://schemas.openxmlformats.org/drawingml/2006/picture">
+                <pic:pic>
+                  <pic:nvPicPr>
+                    <pic:cNvPr id="0" name="fig_grid_opt_noangle.png"/>
+                    <pic:cNvPicPr/>
+                  </pic:nvPicPr>
+                  <pic:blipFill>
+                    <a:blip r:embed="rId13"/>
+                    <a:stretch>
+                      <a:fillRect/>
+                    </a:stretch>
+                  </pic:blipFill>
+                  <pic:spPr>
+                    <a:xfrm>
+                      <a:off x="0" y="0"/>
+                      <a:ext cx="5669280" cy="3752056"/>
+                    </a:xfrm>
+                    <a:prstGeom prst="rect"/>
+                  </pic:spPr>
+                </pic:pic>
+              </a:graphicData>
+            </a:graphic>
+          </wp:inline>
+        </w:drawing>
+      </w:r>
+    </w:p>
+    <w:p>
+      <w:r>
+        <w:t>Figure 4 — Optimizer grid, no angle constraint. Three target points: (10, 10, 0), (0, 12, 0), (8, 3, 0) km. Green bars = solved (miss &lt; 1 m).</w:t>
+      </w:r>
+    </w:p>
+    <w:p>
+      <w:pPr>
+        <w:jc w:val="center"/>
+      </w:pPr>
+      <w:r>
+        <w:drawing>
+          <wp:inline xmlns:a="http://schemas.openxmlformats.org/drawingml/2006/main" xmlns:pic="http://schemas.openxmlformats.org/drawingml/2006/picture">
+            <wp:extent cx="5669280" cy="3752056"/>
+            <wp:docPr id="6" name="Picture 6"/>
+            <wp:cNvGraphicFramePr>
+              <a:graphicFrameLocks noChangeAspect="1"/>
+            </wp:cNvGraphicFramePr>
+            <a:graphic>
+              <a:graphicData uri="http://schemas.openxmlformats.org/drawingml/2006/picture">
+                <pic:pic>
+                  <pic:nvPicPr>
+                    <pic:cNvPr id="0" name="fig_grid_opt_angle.png"/>
+                    <pic:cNvPicPr/>
+                  </pic:nvPicPr>
+                  <pic:blipFill>
+                    <a:blip r:embed="rId14"/>
+                    <a:stretch>
+                      <a:fillRect/>
+                    </a:stretch>
+                  </pic:blipFill>
+                  <pic:spPr>
+                    <a:xfrm>
+                      <a:off x="0" y="0"/>
+                      <a:ext cx="5669280" cy="3752056"/>
+                    </a:xfrm>
+                    <a:prstGeom prst="rect"/>
+                  </pic:spPr>
+                </pic:pic>
+              </a:graphicData>
+            </a:graphic>
+          </wp:inline>
+        </w:drawing>
+      </w:r>
+    </w:p>
+    <w:p>
+      <w:r>
+        <w:t>Figure 5 — Optimizer grid with angle constraints. Two target points × two impact angles (γV = −45° and −70°). ΔγV labels show residual angle error after optimisation. Short-range flat trajectories have limited angle authority at 3 g.</w:t>
       </w:r>
     </w:p>
     <w:sectPr>

</xml_diff>

<commit_message>
docs: remove duplicate Figure 3 (optimizer plot), renumber Figure 4/5 → 3/4
Figure 3 was an identical duplicate of Figure 1 (both showed the same
optimizer 4-panel for the 10 km target). Removed the duplicate and
renumbered the grid optimizer plots accordingly.

Co-Authored-By: Claude Sonnet 4.6 <noreply@anthropic.com>
</commit_message>
<xml_diff>
--- a/files/Booster_Impact_Simulation_Documentation.docx
+++ b/files/Booster_Impact_Simulation_Documentation.docx
@@ -7378,58 +7378,6 @@
           <w:sz w:val="18"/>
         </w:rPr>
         <w:t>Figure 2 — IACPN guidance comparison. Four cases with the same vehicle: ballistic (no guidance), pure PN, and two IACPN configurations with γV = −45° impact angle constraint. Left: ground tracks; centre: altitude; right: flight-path angle showing the angle constraint effect.</w:t>
-      </w:r>
-    </w:p>
-    <w:p/>
-    <w:p>
-      <w:pPr>
-        <w:jc w:val="center"/>
-      </w:pPr>
-      <w:r>
-        <w:drawing>
-          <wp:inline xmlns:a="http://schemas.openxmlformats.org/drawingml/2006/main" xmlns:pic="http://schemas.openxmlformats.org/drawingml/2006/picture">
-            <wp:extent cx="5669280" cy="3896784"/>
-            <wp:docPr id="3" name="Picture 3"/>
-            <wp:cNvGraphicFramePr>
-              <a:graphicFrameLocks noChangeAspect="1"/>
-            </wp:cNvGraphicFramePr>
-            <a:graphic>
-              <a:graphicData uri="http://schemas.openxmlformats.org/drawingml/2006/picture">
-                <pic:pic>
-                  <pic:nvPicPr>
-                    <pic:cNvPr id="0" name="_doc_fig3_optimizer.png"/>
-                    <pic:cNvPicPr/>
-                  </pic:nvPicPr>
-                  <pic:blipFill>
-                    <a:blip r:embed="rId11"/>
-                    <a:stretch>
-                      <a:fillRect/>
-                    </a:stretch>
-                  </pic:blipFill>
-                  <pic:spPr>
-                    <a:xfrm>
-                      <a:off x="0" y="0"/>
-                      <a:ext cx="5669280" cy="3896784"/>
-                    </a:xfrm>
-                    <a:prstGeom prst="rect"/>
-                  </pic:spPr>
-                </pic:pic>
-              </a:graphicData>
-            </a:graphic>
-          </wp:inline>
-        </w:drawing>
-      </w:r>
-    </w:p>
-    <w:p>
-      <w:pPr>
-        <w:jc w:val="center"/>
-      </w:pPr>
-      <w:r>
-        <w:rPr>
-          <w:i/>
-          <w:sz w:val="18"/>
-        </w:rPr>
-        <w:t>Figure 3 — Open-loop trajectory optimiser result. Nominal IACPN miss: 2050.9 m → optimised miss: 0.83 m (solved: True). Bottom panels show the piecewise-linear command schedule (knot points in green) vs the nominal IACPN guidance commands.</w:t>
       </w:r>
     </w:p>
     <w:p/>
@@ -7747,7 +7695,7 @@
     </w:p>
     <w:p>
       <w:r>
-        <w:t>Figure 4 — Optimizer grid, no angle constraint. Three target points: (10, 10, 0), (0, 12, 0), (8, 3, 0) km. Green bars = solved (miss &lt; 1 m).</w:t>
+        <w:t>Figure 3 — Optimizer grid, no angle constraint. Three target points: (10, 10, 0), (0, 12, 0), (8, 3, 0) km. Green bars = solved (miss &lt; 1 m).</w:t>
       </w:r>
     </w:p>
     <w:p>
@@ -7791,7 +7739,7 @@
     </w:p>
     <w:p>
       <w:r>
-        <w:t>Figure 5 — Optimizer grid with angle constraints. Two target points × two impact angles (γV = −45° and −70°). ΔγV labels show residual angle error after optimisation. Short-range flat trajectories have limited angle authority at 3 g.</w:t>
+        <w:t>Figure 4 — Optimizer grid with angle constraints. Two target points × two impact angles (γV = −45° and −70°). ΔγV labels show residual angle error after optimisation. Short-range flat trajectories have limited angle authority at 3 g.</w:t>
       </w:r>
     </w:p>
     <w:sectPr>

</xml_diff>

<commit_message>
docs: update Word documentation to v3.0 direct-collocation optimizer
Sections 16 and 17 rewritten to reflect:
- New section title: Direct-Collocation Trajectory Optimiser (v3.0)
- Merit function: -w_range·RangeOnLine + w_effort·effort + w_time·T_f
- RangeOnLine definition (contiguous terminal segment within angle_tol_deg)
- Direct-collocation formulation (8N+1 vars, 6N+3 equality constraints)
- Single-stage (no two-phase); terminal position = hard equality constraints
- Updated API: N, w_range, w_effort, w_time, angle_tol_deg, n_knots alias
- Section 16.1 replaced with v3.0 design decisions
- Section 17 usage example updated to v3.0 parameter names
- Footer version line updated to v3.0

Co-Authored-By: Claude Sonnet 4.6 <noreply@anthropic.com>
</commit_message>
<xml_diff>
--- a/files/Booster_Impact_Simulation_Documentation.docx
+++ b/files/Booster_Impact_Simulation_Documentation.docx
@@ -6626,7 +6626,7 @@
           <w:color w:val="969696"/>
           <w:sz w:val="18"/>
         </w:rPr>
-        <w:t>Satellite Launcher — Booster Impact Tracker  |  Technical Documentation v2.1  |  April 2026</w:t>
+        <w:t>Satellite Launcher — Booster Impact Tracker  |  Technical Documentation v3.0  |  April 2026</w:t>
       </w:r>
     </w:p>
     <w:p>
@@ -6634,7 +6634,7 @@
         <w:pStyle w:val="Heading1"/>
       </w:pPr>
       <w:r>
-        <w:t>16  Open-Loop Trajectory Optimiser</w:t>
+        <w:t>16  Direct-Collocation Trajectory Optimiser (v3.0)</w:t>
       </w:r>
     </w:p>
     <w:p>
@@ -6647,7 +6647,7 @@
     </w:p>
     <w:p>
       <w:r>
-        <w:t>The module sim/opt_trajectory.py provides an open-loop trajectory optimiser that finds the lateral acceleration schedule (a_nV(t), a_nH(t)) minimising a merit function over the full flight — without using any guidance law. Commands are represented as N piecewise-linear knot points in time and injected directly into the equations of motion.</w:t>
+        <w:t>The module sim/opt_trajectory.py provides a direct-collocation trajectory optimiser that finds the lateral acceleration schedule (a_nV(t), a_nH(t)) maximising RangeOnLine while minimising control effort and flight time — without assuming any guidance law. Unlike a shooting method, both states and controls are decision variables; the equations of motion become equality constraints, giving the solver direct access to gradient information at every node.</w:t>
       </w:r>
     </w:p>
     <w:p>
@@ -6660,7 +6660,7 @@
     </w:p>
     <w:p>
       <w:r>
-        <w:t>J = w_miss · miss_m²  +  w_angle_v · γV_err_deg²  (only when hit_gamma_v is set)  +  w_angle_h · γH_err_deg²  (only when hit_gamma_h is set)  +  w_time · t_flight_s</w:t>
+        <w:t>J = −w_range · RangeOnLine  +  w_effort · Σ|û|²/N  +  w_time · T_f</w:t>
       </w:r>
     </w:p>
     <w:p>
@@ -6668,15 +6668,30 @@
         <w:pStyle w:val="NoSpacing"/>
       </w:pPr>
       <w:r>
-        <w:t>Priority ordering via default weights:</w:t>
+        <w:rPr>
+          <w:rFonts w:ascii="Courier New" w:hAnsi="Courier New"/>
+          <w:sz w:val="18"/>
+        </w:rPr>
+        <w:t>RangeOnLine : arc length (m) of the terminal segment where BOTH γV and γH</w:t>
         <w:br/>
-        <w:t xml:space="preserve">  w_miss    = 1.0        — primary: drives miss toward zero</w:t>
+        <w:t xml:space="preserve">              are within angle_tol_deg of the required approach angles.</w:t>
         <w:br/>
-        <w:t xml:space="preserve">  w_angle_v = 0.01       — secondary: significant once miss &lt; 1 m</w:t>
+        <w:t xml:space="preserve">              Segment is contiguous from the impact node backward.</w:t>
         <w:br/>
-        <w:t xml:space="preserve">  w_angle_h = 0.01       — secondary: significant once miss &lt; 1 m</w:t>
+        <w:t xml:space="preserve">              Smooth sigmoid cumulative-product window used in objective;</w:t>
         <w:br/>
-        <w:t xml:space="preserve">  w_time    = 1e-5       — tertiary: gentle nudge to shorter flights</w:t>
+        <w:t xml:space="preserve">              exact hard-threshold value reported in summary.</w:t>
+        <w:br/>
+        <w:br/>
+        <w:t>Default weights:</w:t>
+        <w:br/>
+        <w:t xml:space="preserve">  w_range   = 1.0    — maximise approach segment length</w:t>
+        <w:br/>
+        <w:t xml:space="preserve">  w_effort  = 1e-3   — penalise control usage (∫|u|² dt / a_max² T)</w:t>
+        <w:br/>
+        <w:t xml:space="preserve">  w_time    = 1e-4   — prefer shorter flights</w:t>
+        <w:br/>
+        <w:t xml:space="preserve">  angle_tol_deg = 5.0 — tolerance for RangeOnLine segment (deg)</w:t>
       </w:r>
     </w:p>
     <w:p>
@@ -6689,9 +6704,11 @@
     </w:p>
     <w:p>
       <w:r>
-        <w:t>sqrt(a_nV² + a_nH²) ≤ a_max_g · G0  at every knot point.</w:t>
+        <w:t>Dynamics (6N equality constraints): s[k+1] = Euler(s[k], u[k], dt_coll) for k=0…N-1.</w:t>
         <w:br/>
-        <w:t>The physical actuator limit (params.a_lat_max) is additionally enforced at every integration step inside sim_open_loop().</w:t>
+        <w:t>Terminal (3 equality constraints): x_N = x_target, y_N = y_target, h_N = z_target.</w:t>
+        <w:br/>
+        <w:t>Control bound: |u_nV|, |u_nH| ≤ a_max_g · G0  (enforced via solver bounds).</w:t>
       </w:r>
     </w:p>
     <w:p>
@@ -6720,7 +6737,7 @@
         <w:pStyle w:val="Heading3"/>
       </w:pPr>
       <w:r>
-        <w:t>optimize_trajectory(params, ...)</w:t>
+        <w:t>optimize_trajectory(params, N=80, a_max_g=None, ...)</w:t>
       </w:r>
     </w:p>
     <w:tbl>
@@ -7087,10 +7104,14 @@
         </w:tc>
       </w:tr>
     </w:tbl>
-    <w:p/>
     <w:p>
       <w:r>
-        <w:t>Returns a dict with keys: summary (scalar comparison), schedule (knot times and commands in SI and g), series (full time-series), nominal (IACPN warm-start result).</w:t>
+        <w:t>Key parameters: N (collocation nodes, default 80), a_max_g, w_range, w_effort, w_time, angle_tol_deg (default 5.0), angle_sharpness, method ('SLSQP'), max_iter (default 300), verbose, miss_threshold, dt. Legacy keyword n_knots accepted as alias for N.</w:t>
+      </w:r>
+    </w:p>
+    <w:p>
+      <w:r>
+        <w:t>Returns a dict with keys: summary (solved, optimised_miss_m, range_on_line_km, gamma_v_err_deg, gamma_h_err_deg, optimised_flight_time_s, slsqp_success, slsqp_message), schedule (collocation node times and commands in SI and g), series (full high-res time-series), nominal (IACPN warm-start result).</w:t>
       </w:r>
     </w:p>
     <w:p>
@@ -7119,7 +7140,7 @@
         <w:pStyle w:val="ListBullet"/>
       </w:pPr>
       <w:r>
-        <w:t>Warm start: a nominal IACPN run provides the initial guess for the command profile. This typically places the optimiser close to the basin of attraction.</w:t>
+        <w:t>Warm start: a nominal IACPN run provides initial controls; these are forward-propagated at dt_coll to build near-zero initial defects for SLSQP.</w:t>
       </w:r>
     </w:p>
     <w:p>
@@ -7127,7 +7148,7 @@
         <w:pStyle w:val="ListBullet"/>
       </w:pPr>
       <w:r>
-        <w:t>Control normalisation: optimisation variables are scaled to [-1, 1] by a_max for better numerical conditioning.</w:t>
+        <w:t>Collocation grid: N nodes with dt_coll = T_f_init / N (adaptive to flight time). Coarser than the final sim dt=0.2 s. Final trajectory re-evaluated at dt=0.2 s.</w:t>
       </w:r>
     </w:p>
     <w:p>
@@ -7135,7 +7156,7 @@
         <w:pStyle w:val="ListBullet"/>
       </w:pPr>
       <w:r>
-        <w:t>Knot span: t_knots runs from 0 to 1.2 × t_f_nominal to allow minor flight-time overruns without extrapolation artifacts.</w:t>
+        <w:t>Decision variables: 8N+1 total (T_f, N controls u_nV, N controls u_nH, 6N state components at nodes 1..N). Equality constraints: 6N+3.</w:t>
       </w:r>
     </w:p>
     <w:p>
@@ -7143,7 +7164,7 @@
         <w:pStyle w:val="ListBullet"/>
       </w:pPr>
       <w:r>
-        <w:t>Termination: the simulation stops at the same conditions as simulate() (h ≤ z_target after passing above, or h ≤ 0).</w:t>
+        <w:t>True direct collocation: each dynamics constraint uses the decision-variable state s[k] as input, not the state propagated from node 0. This gives SLSQP direct gradient access to all intermediate states.</w:t>
       </w:r>
     </w:p>
     <w:p>
@@ -7151,7 +7172,7 @@
         <w:pStyle w:val="ListBullet"/>
       </w:pPr>
       <w:r>
-        <w:t>No guidance law: the optimiser does not call lateral_accel_command(). The resulting command sequence may look quite different from the IACPN profile.</w:t>
+        <w:t>Performance: N=80 gives 641 variables and 483 constraints. SLSQP uses finite-difference Jacobians. Recommended max_iter ≥ 300. Reduce N for faster convergence on constrained hardware.</w:t>
       </w:r>
     </w:p>
     <w:p>
@@ -7167,20 +7188,43 @@
         <w:pStyle w:val="NoSpacing"/>
       </w:pPr>
       <w:r>
+        <w:rPr>
+          <w:rFonts w:ascii="Courier New" w:hAnsi="Courier New"/>
+          <w:sz w:val="18"/>
+        </w:rPr>
         <w:t>from sim.opt_trajectory import optimize_trajectory, plot_optimised</w:t>
         <w:br/>
-        <w:t>result = optimize_trajectory(params, n_knots=20, a_max_g=3.0)</w:t>
+        <w:t>from sim.physics import Params</w:t>
         <w:br/>
-        <w:t>print(result["summary"])</w:t>
+        <w:br/>
+        <w:t>p = Params(</w:t>
+        <w:br/>
+        <w:t xml:space="preserve">    m_pay=10, m_prop=100, m_str=50, isp=260, thrust_kn=31, burn_max=20,</w:t>
+        <w:br/>
+        <w:t xml:space="preserve">    cd=0.4, cd_fall=0.4, diam=0.5, launch_angle=45, launch_azimuth=45,</w:t>
+        <w:br/>
+        <w:t xml:space="preserve">    x_target=20, y_target=20, z_target=0, a_lat_max=20.0,</w:t>
+        <w:br/>
+        <w:t xml:space="preserve">    hit_gamma_v=-45.0,   # required impact flight-path angle (deg)</w:t>
+        <w:br/>
+        <w:t xml:space="preserve">    hit_gamma_h=45.0,    # required impact azimuth (deg)</w:t>
+        <w:br/>
+        <w:t>)</w:t>
+        <w:br/>
+        <w:br/>
+        <w:t>result = optimize_trajectory(</w:t>
+        <w:br/>
+        <w:t xml:space="preserve">    p, N=60, a_max_g=20.0,</w:t>
+        <w:br/>
+        <w:t xml:space="preserve">    w_range=1.0, w_effort=1e-3, w_time=1e-4,</w:t>
+        <w:br/>
+        <w:t xml:space="preserve">    angle_tol_deg=5.0, max_iter=300, verbose=True,</w:t>
+        <w:br/>
+        <w:t>)</w:t>
+        <w:br/>
+        <w:t>print(result["summary"])   # includes range_on_line_km</w:t>
         <w:br/>
         <w:t>plot_optimised(result)</w:t>
-        <w:br/>
-        <w:br/>
-        <w:t># With impact angle constraint</w:t>
-        <w:br/>
-        <w:t>p2 = replace(params, hit_gamma_v=-70.0)</w:t>
-        <w:br/>
-        <w:t>result2 = optimize_trajectory(p2, w_angle_v=0.01)</w:t>
       </w:r>
     </w:p>
     <w:p>
@@ -7188,7 +7232,7 @@
         <w:pStyle w:val="Heading2"/>
       </w:pPr>
       <w:r>
-        <w:t>16.1  Optimizer — v2.2 Fixes</w:t>
+        <w:t>16.1  Optimizer v3.0 — Key Design Decisions</w:t>
       </w:r>
     </w:p>
     <w:p>
@@ -7199,11 +7243,9 @@
         <w:rPr>
           <w:b/>
         </w:rPr>
-        <w:t xml:space="preserve">Best-ever tracking: </w:t>
+        <w:t>Single-stage: No two-phase approach. RangeOnLine already encodes the angle requirement — a long on-line segment is only possible when the booster both reaches the target AND holds the correct approach angle for an extended final segment.</w:t>
       </w:r>
-      <w:r>
-        <w:t>The optimiser now saves and returns the best solution found across ALL function evaluations, not just the final iterate. Hitting max_iter no longer discards a good intermediate result.</w:t>
-      </w:r>
+      <w:r/>
     </w:p>
     <w:p>
       <w:pPr>
@@ -7213,11 +7255,9 @@
         <w:rPr>
           <w:b/>
         </w:rPr>
-        <w:t xml:space="preserve">Two-phase strategy for angle constraints: </w:t>
+        <w:t>Smooth objective: RangeOnLine uses a sigmoid cumulative-product window P[k] = Π_{j=k}^{N} σ(tol − err_j) so the gradient is non-zero everywhere. The exact (hard-threshold) value is reported in the summary after re-running the final high-resolution forward simulation.</w:t>
       </w:r>
-      <w:r>
-        <w:t>When hit_gamma_v or hit_gamma_h is set, optimisation runs in two phases. Phase 1 minimises miss only (angle terms off) to guarantee miss &lt; 1 m. Phase 2 runs the full merit function from the Phase 1 result, improving angle accuracy while the large w_miss weight keeps miss small.</w:t>
-      </w:r>
+      <w:r/>
     </w:p>
     <w:p>
       <w:pPr>
@@ -7227,11 +7267,9 @@
         <w:rPr>
           <w:b/>
         </w:rPr>
-        <w:t xml:space="preserve">No-angle warm start: </w:t>
+        <w:t>Terminal constraints replace miss penalty: x_N = x_target, y_N = y_target, h_N = z_target are hard equality constraints, not objective terms. The solver must satisfy them; the objective only shapes the approach.</w:t>
       </w:r>
-      <w:r>
-        <w:t>The initial guess (x0) is always taken from a no-angle-constraint IACPN run. When angle constraints are set, the angle-constrained IACPN guidance can produce a poor trajectory (guidance fighting itself). The no-angle warm start provides a cleaner starting point for Phase 1.</w:t>
-      </w:r>
+      <w:r/>
     </w:p>
     <w:p>
       <w:pPr>
@@ -7241,11 +7279,9 @@
         <w:rPr>
           <w:b/>
         </w:rPr>
-        <w:t xml:space="preserve">solved flag replaces optimiser_success: </w:t>
+        <w:t>Backward compatibility: n_knots is accepted as an alias for N. Legacy weight kwargs (w_miss, w_angle_v, w_angle_h, use_de, dt_eval) are silently absorbed so existing grid_run.py opt_kwargs dicts continue to work.</w:t>
       </w:r>
-      <w:r>
-        <w:t>The summary dict now contains solved = (optimised_miss_m &lt; 1.0) instead of the confusing scipy optimiser_success flag. optimiser_success reflects algorithm convergence, not solution quality; solved directly answers "was the miss requirement met?".</w:t>
-      </w:r>
+      <w:r/>
     </w:p>
     <w:p>
       <w:pPr>
@@ -7257,15 +7293,7 @@
     </w:p>
     <w:p>
       <w:r>
-        <w:t>The achievable angle accuracy depends on the trajectory energy available. For short-range flat trajectories (natural impact angle near 0°), a 3 g lateral acceleration limit can steer only a few degrees steeper. For steep impact angles (-60° to -70°), design the scenario with:</w:t>
-        <w:br/>
-        <w:t xml:space="preserve">  • larger launch angle (e.g. 70–80°) for a higher arc</w:t>
-        <w:br/>
-        <w:t xml:space="preserve">  • longer range target</w:t>
-        <w:br/>
-        <w:t xml:space="preserve">  • larger a_max_g</w:t>
-        <w:br/>
-        <w:t xml:space="preserve">  • use_de=True for global search across trajectory shapes</w:t>
+        <w:t>RangeOnLine depends on trajectory energy. For short-range flat trajectories (natural impact near 0°), a small a_max_g may not produce a long on-line segment for steep angle requirements. Increase a_max_g, launch angle, or range to improve achievable RangeOnLine. The slsqp_message field indicates whether the solver converged; increase max_iter or reduce N if convergence fails.</w:t>
       </w:r>
     </w:p>
     <w:p>
@@ -7399,7 +7427,7 @@
     </w:p>
     <w:p>
       <w:r>
-        <w:t>run_grid() now accepts optimise=True to run optimize_trajectory() for every cell in the hit_points × hit_angles Cartesian product, instead of the IACPN guidance simulation. All other behaviour (cross-product, plot_grid, summary table) is unchanged.</w:t>
+        <w:t>run_grid() accepts optimise=True to run optimize_trajectory() (direct-collocation, v3.0) for every cell in the hit_points × hit_angles Cartesian product. All other behaviour (cross-product, normalised series/summary, plot_grid) is unchanged. The summary now also includes range_on_line_km for each run.</w:t>
       </w:r>
     </w:p>
     <w:p>
@@ -7619,26 +7647,39 @@
         <w:pStyle w:val="NoSpacing"/>
       </w:pPr>
       <w:r>
+        <w:rPr>
+          <w:rFonts w:ascii="Courier New" w:hAnsi="Courier New"/>
+          <w:sz w:val="18"/>
+        </w:rPr>
         <w:t>from grid_run import run_grid, plot_grid</w:t>
         <w:br/>
         <w:br/>
-        <w:t># IACPN grid (original)</w:t>
+        <w:t># IACPN grid</w:t>
         <w:br/>
         <w:t>runs_sim = run_grid(base, hit_points, hit_angles=hit_angles)</w:t>
         <w:br/>
         <w:br/>
-        <w:t># Optimizer grid</w:t>
+        <w:t># Optimizer grid (direct collocation, RangeOnLine merit)</w:t>
         <w:br/>
-        <w:t>runs_opt = run_grid(base, hit_points, hit_angles=hit_angles,</w:t>
+        <w:t>runs_opt = run_grid(</w:t>
         <w:br/>
-        <w:t xml:space="preserve">                    optimise=True,</w:t>
+        <w:t xml:space="preserve">    base, hit_points, hit_angles=hit_angles,</w:t>
         <w:br/>
-        <w:t xml:space="preserve">                    opt_kwargs=dict(n_knots=20, a_max_g=3.0,</w:t>
+        <w:t xml:space="preserve">    optimise=True,</w:t>
         <w:br/>
-        <w:t xml:space="preserve">                                    w_angle_v=0.01, max_iter=400))</w:t>
+        <w:t xml:space="preserve">    opt_kwargs=dict(</w:t>
         <w:br/>
+        <w:t xml:space="preserve">        N=60, a_max_g=3.0,</w:t>
         <w:br/>
-        <w:t>plot_grid(runs_opt, title="Optimizer grid")</w:t>
+        <w:t xml:space="preserve">        w_range=1.0, w_effort=1e-3, w_time=1e-4,</w:t>
+        <w:br/>
+        <w:t xml:space="preserve">        angle_tol_deg=5.0, max_iter=300,</w:t>
+        <w:br/>
+        <w:t xml:space="preserve">    ),</w:t>
+        <w:br/>
+        <w:t>)</w:t>
+        <w:br/>
+        <w:t>plot_grid(runs_opt)</w:t>
       </w:r>
     </w:p>
     <w:p>

</xml_diff>

<commit_message>
fix: apogee freeze in integrate_step (v3.2)
When CL is high enough that burnout γV approaches 90°, the vehicle
reaches apogee with near-zero speed while pointing nearly straight up.
The previous max(0, v + dv·dt) clamp froze v=0 permanently — the
simulation hit the 60000-step safety limit (12000 s) and never landed.

Fix: when v_raw < 0, the vehicle has passed apogee and reversed
direction. Reflect the velocity vector: new_v = -v_raw, new_γV flips
sign, new_γH += π.  All 15 check vectors pass; 0.9 m guidance miss
unchanged.  Section 8 CL sweep now terminates correctly for all values.

Co-Authored-By: Claude Sonnet 4.6 <noreply@anthropic.com>
</commit_message>
<xml_diff>
--- a/files/Booster_Impact_Simulation_Documentation.docx
+++ b/files/Booster_Impact_Simulation_Documentation.docx
@@ -33,10 +33,9 @@
       </w:pPr>
       <w:r>
         <w:rPr>
-          <w:color w:val="828282"/>
-          <w:sz w:val="22"/>
+          <w:b w:val="0"/>
         </w:rPr>
-        <w:t>Version 2.1 — April 04, 2026</w:t>
+        <w:t>Version 3.2 — April 14, 2026</w:t>
       </w:r>
     </w:p>
     <w:p/>
@@ -6622,11 +6621,25 @@
         <w:jc w:val="center"/>
       </w:pPr>
       <w:r>
-        <w:rPr>
-          <w:color w:val="969696"/>
-          <w:sz w:val="18"/>
-        </w:rPr>
-        <w:t>Satellite Launcher — Booster Impact Tracker  |  Technical Documentation v3.0  |  April 2026</w:t>
+        <w:t>Satellite Launcher — Booster Impact Tracker  |  Technical Documentation v3.2  |  April 2026</w:t>
+      </w:r>
+    </w:p>
+    <w:p>
+      <w:pPr>
+        <w:pStyle w:val="Heading2"/>
+      </w:pPr>
+      <w:r>
+        <w:t>v3.2 — Bug fix: apogee handling in integrate_step (April 14, 2026)</w:t>
+      </w:r>
+    </w:p>
+    <w:p>
+      <w:r>
+        <w:t>Bug: When a vehicle with high lift coefficient (CL ≥ ~0.4) reached apogee with a steep flight-path angle (γV near 90°), the forward-Euler integrator clamped speed to max(0, v + dv·dt) = 0. With γV held fixed at rotation_active=False, both v and h became permanently frozen at peak altitude. The simulation hit the _MAX_STEPS=60000 safety limit (12000 s), causing Section 8 (lift coefficient sweep) plots to show a 12000 s x-axis — making the CL=0 and CL=0.2 trajectories (&lt; 100 s) invisible.</w:t>
+      </w:r>
+    </w:p>
+    <w:p>
+      <w:r>
+        <w:t>Fix (sim/physics.py, integrate_step): when v_raw = v + dv_dt·dt &lt; 0, the vehicle has passed apogee and reversed direction. New behaviour: new_v = -v_raw, new_γV = -(γV + dγV·dt), new_γH = γH + dγH·dt + π. The velocity vector is reflected correctly through the apogee point. All 15 check vectors pass. Section 8 CL sweep now terminates: CL=0→58 s, CL=0.2→97 s, CL=0.5→135 s, CL=1.0→167 s. The 0.9 m guidance miss is unchanged.</w:t>
       </w:r>
     </w:p>
     <w:p>

</xml_diff>

<commit_message>
fix: simulation stop condition for below-ground targets (v3.2)
Hard-coded h<=0 stop prevented reaching targets at negative altitude.
Changed to h<=min(0, z_target_m) so the simulation runs past ground
level when z_target < 0. All 15 check vectors pass.

Co-Authored-By: Claude Sonnet 4.6 <noreply@anthropic.com>
</commit_message>
<xml_diff>
--- a/files/Booster_Impact_Simulation_Documentation.docx
+++ b/files/Booster_Impact_Simulation_Documentation.docx
@@ -7138,6 +7138,24 @@
       <w:r>
         <w:rPr/>
         <w:t xml:space="preserve">Prerequisite: pip install casadi  (CasADi 3.7+ with bundled IPOPT).</w:t>
+      </w:r>
+    </w:p>
+    <w:p>
+      <w:pPr>
+        <w:pStyle w:val="Heading2"/>
+      </w:pPr>
+      <w:r>
+        <w:t>v3.2 — Bug fix: simulation stop condition for below-ground targets (April 14, 2026)</w:t>
+      </w:r>
+    </w:p>
+    <w:p>
+      <w:r>
+        <w:t>Bug: simulate.py terminated when h &lt;= 0 regardless of z_target. For targets below ground level (z_target &lt; 0), the simulation stopped at h=0 instead of continuing to the target altitude.</w:t>
+      </w:r>
+    </w:p>
+    <w:p>
+      <w:r>
+        <w:t>Fix (sim/simulate.py): changed stop condition from h &lt;= 0 to h &lt;= min(0, z_target_m). Ground-level targets (z_target=0) behave identically. Below-ground targets now correctly continue past h=0 until the target altitude is reached. All 15 check vectors pass.</w:t>
       </w:r>
     </w:p>
     <w:p>

</xml_diff>

<commit_message>
feat: redesign simulation termination for backwards trajectories (v3.2)
Three stop conditions replace the old passed_above_target / h<=0 logic:

1. 3-D proximity < 100 m (armed after vehicle moves > 500 m from target)
   — primary stop for on-target and loop-back backwards trajectories
2. Altitude floor h <= z_target_m (gated on vehicle having climbed > 50 m)
   — catches horizontal misses that hit the ground
3. v < v_min_stop post-burnout (new Params field, default None = disabled)
   — stops stalled vehicles that can no longer reach target

Also move r_to_target computation outside the guidance block so it is
available to both guidance range-gate and termination checks.
All 15 check vectors pass.

Co-Authored-By: Claude Sonnet 4.6 <noreply@anthropic.com>
</commit_message>
<xml_diff>
--- a/files/Booster_Impact_Simulation_Documentation.docx
+++ b/files/Booster_Impact_Simulation_Documentation.docx
@@ -7156,6 +7156,48 @@
     <w:p>
       <w:r>
         <w:t>Fix (sim/simulate.py): changed stop condition from h &lt;= 0 to h &lt;= min(0, z_target_m). Ground-level targets (z_target=0) behave identically. Below-ground targets now correctly continue past h=0 until the target altitude is reached. All 15 check vectors pass.</w:t>
+      </w:r>
+    </w:p>
+    <w:p>
+      <w:pPr>
+        <w:pStyle w:val="Heading2"/>
+      </w:pPr>
+      <w:r>
+        <w:t>v3.2 — Improved simulation termination for backwards trajectories (April 14, 2026)</w:t>
+      </w:r>
+    </w:p>
+    <w:p>
+      <w:r>
+        <w:t>The simulation termination logic was redesigned to support backwards trajectories (where the booster overshoots the target and curves back). Three stop conditions now apply (in addition to the _MAX_STEPS safety limit):</w:t>
+      </w:r>
+    </w:p>
+    <w:p>
+      <w:pPr>
+        <w:pStyle w:val="ListBullet"/>
+      </w:pPr>
+      <w:r>
+        <w:t>(1) 3-D proximity &lt; 100 m — armed after vehicle moves &gt; 500 m from target. Primary stop for on-target approaches and backwards loop-back trajectories.</w:t>
+      </w:r>
+    </w:p>
+    <w:p>
+      <w:pPr>
+        <w:pStyle w:val="ListBullet"/>
+      </w:pPr>
+      <w:r>
+        <w:t>(2) Altitude floor — h &lt;= z_target_m, gated by vehicle having first climbed &gt; 50 m above z_target. Catches vehicles that miss horizontally and hit ground.</w:t>
+      </w:r>
+    </w:p>
+    <w:p>
+      <w:pPr>
+        <w:pStyle w:val="ListBullet"/>
+      </w:pPr>
+      <w:r>
+        <w:t>(3) Stalled post-burnout — v &lt; v_min_stop (new Params field, default None = disabled). Stops a vehicle that can no longer reach the target.</w:t>
+      </w:r>
+    </w:p>
+    <w:p>
+      <w:r>
+        <w:t>The old passed_above_target boolean and hard-coded h&lt;=0 floor are removed. All 15 check vectors pass unchanged.</w:t>
       </w:r>
     </w:p>
     <w:p>
@@ -7643,6 +7685,30 @@
     <w:p>
       <w:r>
         <w:t>Figure 4 — Optimizer grid (v3.0), tighter tolerance angle_tol_deg=3°. Same targets and angle cases as Figure 3. 0/6 runs solved. ΔγV labels show residual impact angle error.</w:t>
+      </w:r>
+    </w:p>
+    <w:p>
+      <w:pPr>
+        <w:pStyle w:val="ListBullet"/>
+      </w:pPr>
+      <w:r>
+        <w:t>(1) 3-D proximity &lt; 100 m — armed after vehicle moves &gt; 500 m from target. Primary stop for on-target approaches and backwards loop-back trajectories.</w:t>
+      </w:r>
+    </w:p>
+    <w:p>
+      <w:pPr>
+        <w:pStyle w:val="ListBullet"/>
+      </w:pPr>
+      <w:r>
+        <w:t>(2) Altitude floor — h &lt;= z_target_m, gated by vehicle having first climbed &gt; 50 m above z_target. Catches vehicles that miss horizontally and hit ground.</w:t>
+      </w:r>
+    </w:p>
+    <w:p>
+      <w:pPr>
+        <w:pStyle w:val="ListBullet"/>
+      </w:pPr>
+      <w:r>
+        <w:t>(3) Stalled post-burnout — v &lt; v_min_stop (new Params field, default None = disabled). Stops a vehicle that can no longer reach the target.</w:t>
       </w:r>
     </w:p>
     <w:sectPr>

</xml_diff>

<commit_message>
collocate.py v3.2: softplus merit for control effort and miss distance
- Replace trapezoidal ctrl_effort integral with softplus-based mean-% penalty:
  pct_k = |u_k| / a_max(v_k) * 100 at each node; penalty ~0 below 50%,
  ~100 at 80%, ~901 at 95%, ~1668 at 100% (two-term softplus)
- Fix NameError: move _softplus() definition before _ctrl_merit() that uses it
- Miss merit uses softplus with 100 m dead zone (unchanged from previous commit)
- All 15 check vectors pass

Co-Authored-By: Claude Sonnet 4.6 <noreply@anthropic.com>
</commit_message>
<xml_diff>
--- a/files/Booster_Impact_Simulation_Documentation.docx
+++ b/files/Booster_Impact_Simulation_Documentation.docx
@@ -6830,8 +6830,7 @@
         <w:pStyle w:val="Normal"/>
       </w:pPr>
       <w:r>
-        <w:rPr/>
-        <w:t xml:space="preserve">When both hit_gamma_v and hit_gamma_h are set, collocation_solve() uses the hit-line formulation:</w:t>
+        <w:t>When both hit_gamma_v and hit_gamma_h are set, collocation_solve() uses the hit-line formulation. The merit function uses softplus-based penalties for control effort and miss distance:</w:t>
       </w:r>
     </w:p>
     <w:p>
@@ -6839,8 +6838,7 @@
         <w:pStyle w:val="Normal"/>
       </w:pPr>
       <w:r>
-        <w:rPr/>
-        <w:t xml:space="preserve">J = w_ctrl * integral(|u|^2 dt) / a_max^2   +   w_time * T_f</w:t>
+        <w:t>J = w_ctrl * ctrl_effort(pct_mean)   +   w_miss * miss_merit(miss_m)   +   w_time * T_f</w:t>
       </w:r>
     </w:p>
     <w:p>
@@ -6848,8 +6846,7 @@
         <w:pStyle w:val="Normal"/>
       </w:pPr>
       <w:r>
-        <w:rPr/>
-        <w:t xml:space="preserve">Subject to:</w:t>
+        <w:t>Control effort penalty (pct_mean = mean of |u_k|/a_max(v_k) * 100% across all nodes):</w:t>
       </w:r>
     </w:p>
     <w:p>
@@ -6857,8 +6854,7 @@
         <w:pStyle w:val="Normal"/>
       </w:pPr>
       <w:r>
-        <w:rPr/>
-        <w:t xml:space="preserve">  •  Hermite-Simpson dynamics equality constraints at every collocation node</w:t>
+        <w:t xml:space="preserve">  ctrl_effort(p) = a1*(softplus(p - 50) - log2)  +  a2*softplus(1.5*(p - 90))</w:t>
       </w:r>
     </w:p>
     <w:p>
@@ -6866,8 +6862,7 @@
         <w:pStyle w:val="Normal"/>
       </w:pPr>
       <w:r>
-        <w:rPr/>
-        <w:t xml:space="preserve">  •  Terminal position on the hit line: x_f = x_t + s*d_x, y_f = y_t + s*d_y, h_f = z_t + s*d_z</w:t>
+        <w:t xml:space="preserve">  Shape: ~0 for p&lt;50%, ~100 at p=80%, ~901 at p=95%, ~1668 at p=100%.</w:t>
       </w:r>
     </w:p>
     <w:p>
@@ -6875,8 +6870,7 @@
         <w:pStyle w:val="Normal"/>
       </w:pPr>
       <w:r>
-        <w:rPr/>
-        <w:t xml:space="preserve">  •  |gV_f - gV_des| &lt;= angle_tol_deg  (hard inequality)</w:t>
+        <w:t>Miss distance penalty (dead zone = miss_deadzone, default 100 m):</w:t>
       </w:r>
     </w:p>
     <w:p>
@@ -6884,8 +6878,7 @@
         <w:pStyle w:val="Normal"/>
       </w:pPr>
       <w:r>
-        <w:rPr/>
-        <w:t xml:space="preserve">  •  cos(gH_f - gH_des) &gt;= cos(angle_tol_deg)  (hard inequality, handles ±180° wrap)</w:t>
+        <w:t xml:space="preserve">  miss_merit(m) = scale * (softplus(m - deadzone) - log2)   [~0 below deadzone, ~50 at deadzone+400m]</w:t>
       </w:r>
     </w:p>
     <w:p>
@@ -6893,8 +6886,7 @@
         <w:pStyle w:val="Normal"/>
       </w:pPr>
       <w:r>
-        <w:rPr/>
-        <w:t xml:space="preserve">  •  s in [-hit_line_range_max, +hit_line_range_max] km  (free offset along approach line)</w:t>
+        <w:t>Hard constraints (unchanged):</w:t>
       </w:r>
     </w:p>
     <w:p>

</xml_diff>

<commit_message>
docs: fix stale algorithm walkthrough in section 7
- Step 8: replace 'Clamp v >= 0' with apogee direction-flip description
- Step 11: replace 'h < 0' with current 3-condition termination logic

Co-Authored-By: Claude Sonnet 4.6 <noreply@anthropic.com>
</commit_message>
<xml_diff>
--- a/files/Booster_Impact_Simulation_Documentation.docx
+++ b/files/Booster_Impact_Simulation_Documentation.docx
@@ -4761,7 +4761,7 @@
         <w:spacing w:after="40"/>
       </w:pPr>
       <w:r>
-        <w:t>8. Integrate: v += dv/dt·Δt;  γV += dγV/dt·Δt;  γH += dγH/dt·Δt.  Clamp v ≥ 0, |γV| &lt; 90°.</w:t>
+        <w:t>8. Integrate: v += dv/dt·Δt;  γV += dγV/dt·Δt;  γH += dγH/dt·Δt.  If v_raw &lt; 0 (apogee passed), flip: v = -v_raw, γV = -γV, γH = γH + π.  Clamp |γV| &lt; 90°.</w:t>
       </w:r>
     </w:p>
     <w:p>
@@ -4788,7 +4788,7 @@
         <w:spacing w:after="40"/>
       </w:pPr>
       <w:r>
-        <w:t>11. Terminate when h &lt; 0 (impact) or loop limit reached.</w:t>
+        <w:t>11. Terminate when: (1) 3-D range to target &lt; 100 m (armed after moving &gt; 500 m from target), OR (2) h &lt;= z_target after first climbing &gt; 50 m above it, OR (3) v &lt; v_min_stop after burnout (if set), OR loop limit reached.</w:t>
       </w:r>
     </w:p>
     <w:p>

</xml_diff>

<commit_message>
docs: rebuild section 16 with full collocation algorithm + fresh figures
- Complete Hermite-Simpson algorithm explanation (defect equations, 2-phase
  structure, path constraints, variable count)
- Hit-line mode: approach line formulation, offset interpretation
- Merit function: ctrl_effort softplus curve, miss_merit dead zone
- Warm start rationale (why unconstrained IACPN)
- Public API reference with all parameters and result keys
- Fresh demo results (solved=True, miss=38.6m, gV_err=5.0deg)
- 3 new figures: merit curve, 4-panel collocate trajectory, IACPN comparison
- Updated stale algorithm walkthrough (step 8 apogee flip, step 11 termination)

Co-Authored-By: Claude Sonnet 4.6 <noreply@anthropic.com>
</commit_message>
<xml_diff>
--- a/files/Booster_Impact_Simulation_Documentation.docx
+++ b/files/Booster_Impact_Simulation_Documentation.docx
@@ -6644,552 +6644,536 @@
     </w:p>
     <w:p>
       <w:pPr>
-        <w:pStyle w:val="Heading 1"/>
+        <w:pStyle w:val="Heading1"/>
       </w:pPr>
       <w:r>
-        <w:rPr/>
-        <w:t xml:space="preserve">16  Trajectory Optimisation — Direct Collocation (CasADi + IPOPT)</w:t>
+        <w:t>16  Trajectory Optimisation — Direct Collocation (CasADi + IPOPT)</w:t>
       </w:r>
     </w:p>
     <w:p>
-      <w:pPr>
-        <w:pStyle w:val="Normal"/>
-      </w:pPr>
+      <w:pPr/>
       <w:r>
-        <w:rPr/>
-        <w:t xml:space="preserve">The sim/collocate.py module implements Hermite-Simpson direct collocation solved by IPOPT (via CasADi automatic differentiation). This replaces the earlier SLSQP-based optimize_trajectory() in sim/opt_trajectory.py, which suffered from three compounding failures that prevented it from answering the merit function.</w:t>
+        <w:t>The sim/collocate.py module finds the lateral acceleration schedule (a_nV(t), a_nH(t)) that satisfies desired impact angle constraints while minimising control effort and flight time. It uses Hermite-Simpson direct collocation solved by IPOPT via CasADi, which provides exact analytic gradients through automatic differentiation.</w:t>
       </w:r>
     </w:p>
     <w:p>
       <w:pPr>
-        <w:pStyle w:val="Heading 2"/>
+        <w:pStyle w:val="Heading2"/>
       </w:pPr>
       <w:r>
-        <w:rPr/>
-        <w:t xml:space="preserve">16.1  Bugs Fixed in collocate.py</w:t>
+        <w:t>16.1  Algorithm: Hermite-Simpson Direct Collocation</w:t>
       </w:r>
     </w:p>
     <w:p>
-      <w:pPr>
-        <w:pStyle w:val="Normal"/>
-      </w:pPr>
+      <w:pPr/>
       <w:r>
-        <w:rPr/>
-        <w:t xml:space="preserve">Three bugs prevented collocate.py from converging. All three are now fixed:</w:t>
+        <w:t>Direct collocation transcribes the continuous optimal control problem (OCP) into a single large nonlinear program (NLP). States and controls at every collocation node become optimisation variables, and the vehicle dynamics appear as equality constraints (Hermite-Simpson defects). The NLP is solved in one pass by IPOPT using exact sparse Jacobians.</w:t>
       </w:r>
     </w:p>
     <w:p>
-      <w:pPr>
-        <w:pStyle w:val="Normal"/>
-      </w:pPr>
+      <w:pPr/>
       <w:r>
-        <w:rPr>
-          <w:b/>
-        </w:rPr>
-        <w:t xml:space="preserve">Bug 1 — Angle-constrained warm start.</w:t>
+        <w:t>Two-phase problem structure:</w:t>
       </w:r>
     </w:p>
     <w:p>
       <w:pPr>
-        <w:pStyle w:val="Normal"/>
+        <w:pStyle w:val="NoSpacing"/>
       </w:pPr>
       <w:r>
-        <w:rPr/>
-        <w:t xml:space="preserve">The IACPN reference run used the angle-constrained params (hit_gamma_v, hit_gamma_h set). Angle-constrained IACPN fights itself, producing a chaotic trajectory that made a bad initial guess for IPOPT. Fix: always use no-angle IACPN for the warm start, then let IPOPT steer to the angle solution.</w:t>
+        <w:t xml:space="preserve">  Phase 1 — Powered:  N1 Hermite-Simpson segments over t in [0, t_burn].</w:t>
+        <w:br/>
+        <w:t xml:space="preserve">    State s1 = [v, gV, gH, h, x, y, mass]  (7 states per node)</w:t>
+        <w:br/>
+        <w:t xml:space="preserve">  Phase 2 — Coast:    N2 Hermite-Simpson segments over t in [t_burn, T_f].</w:t>
+        <w:br/>
+        <w:t xml:space="preserve">    State s2 = [v, gV, gH, h, x, y]         (6 states; mass fixed at burnout value)</w:t>
+        <w:br/>
+        <w:t xml:space="preserve">  t_burn is fixed (determined by propellant mass and burn_max).</w:t>
+        <w:br/>
+        <w:t xml:space="preserve">  T_f    is a free optimisation variable (total flight time).</w:t>
       </w:r>
     </w:p>
     <w:p>
-      <w:pPr>
-        <w:pStyle w:val="Normal"/>
-      </w:pPr>
+      <w:pPr/>
       <w:r>
-        <w:rPr>
-          <w:b/>
-        </w:rPr>
-        <w:t xml:space="preserve">Bug 2 — Missing state bounds.</w:t>
+        <w:t>Hermite-Simpson defect constraint (per segment, step dt):</w:t>
       </w:r>
     </w:p>
     <w:p>
       <w:pPr>
-        <w:pStyle w:val="Normal"/>
+        <w:pStyle w:val="NoSpacing"/>
       </w:pPr>
       <w:r>
-        <w:rPr/>
-        <w:t xml:space="preserve">No bounds on gV or gH at intermediate collocation nodes. Without bounds, IPOPT drove flight-path angles to ±1000° (numerically valid via sin/cos but physically meaningless). Fix: added gV in [-pi/2, pi/2] and gH in [gH0 ± (pi+0.5)] at every node.</w:t>
+        <w:t xml:space="preserve">  s_mid  = (s_k + s_{k+1})/2  +  (dt/8) * [f(s_k, u_k) - f(s_{k+1}, u_{k+1})]</w:t>
+        <w:br/>
+        <w:t xml:space="preserve">  u_mid  = (u_k + u_{k+1}) / 2</w:t>
+        <w:br/>
+        <w:t xml:space="preserve">  defect = s_{k+1} - s_k - (dt/6) * [f(s_k, u_k) + 4*f(s_mid, u_mid) + f(s_{k+1}, u_{k+1})] = 0</w:t>
       </w:r>
     </w:p>
     <w:p>
-      <w:pPr>
-        <w:pStyle w:val="Normal"/>
-      </w:pPr>
+      <w:pPr/>
       <w:r>
-        <w:rPr>
-          <w:b/>
-        </w:rPr>
-        <w:t xml:space="preserve">Bug 3 — Singularity at v=0.</w:t>
+        <w:t>This 3-point Simpson rule is second-order accurate in the state trajectory and ensures each segment satisfies the ODE to within truncation error. With N1=15 and N2=30 segments the NLP has approximately 900 variables and 700 equality constraints.</w:t>
       </w:r>
     </w:p>
     <w:p>
-      <w:pPr>
-        <w:pStyle w:val="Normal"/>
-      </w:pPr>
+      <w:pPr/>
       <w:r>
-        <w:rPr/>
-        <w:t xml:space="preserve">The angle-rate equations contain dgV = g*cos(gV)/v and dgH = a_nH/v. At v=0 (launch), these blow up: g/v -&gt; inf. The Hermite-Simpson defect at the first segment evaluates the dynamics at v=0, producing constraint violations ~10^23 and causing IPOPT to exit with "Restoration Failed" after &lt;40 iterations. Fix: clamp v to max(v, grav_turn_v_min) in angle-rate denominators only (not in dv). This mirrors the rotation_active threshold in physics.integrate_step.</w:t>
+        <w:t>Path constraints enforced at every node:</w:t>
       </w:r>
     </w:p>
     <w:p>
       <w:pPr>
-        <w:pStyle w:val="Heading 2"/>
+        <w:pStyle w:val="NoSpacing"/>
       </w:pPr>
       <w:r>
-        <w:rPr/>
-        <w:t xml:space="preserve">16.2  Why SLSQP Failed</w:t>
+        <w:t xml:space="preserve">  - Control:  |u_k|^2 &lt;= a_max(v_k)^2  (circular bound, supports velocity-dependent a_max)</w:t>
+        <w:br/>
+        <w:t xml:space="preserve">  - Altitude: h_k &gt;= 0</w:t>
+        <w:br/>
+        <w:t xml:space="preserve">  - Speed:    v_k &gt;= 0</w:t>
+        <w:br/>
+        <w:t xml:space="preserve">  - gV:       |gV_k| &lt; 90 deg  (prevents IPOPT driving angles to +-1000 deg)</w:t>
+        <w:br/>
+        <w:t xml:space="preserve">  - gH:       |gH_k - gH_launch| &lt; 210 deg  (prevents heading wrap)</w:t>
       </w:r>
     </w:p>
     <w:p>
       <w:pPr>
-        <w:pStyle w:val="Normal"/>
+        <w:pStyle w:val="Heading2"/>
       </w:pPr>
       <w:r>
-        <w:rPr/>
-        <w:t xml:space="preserve">The SLSQP-based optimizer (sim/opt_trajectory.py) had three separate issues:</w:t>
+        <w:t>16.2  Hit-Line Mode</w:t>
       </w:r>
     </w:p>
     <w:p>
-      <w:pPr>
-        <w:pStyle w:val="Normal"/>
-      </w:pPr>
+      <w:pPr/>
       <w:r>
-        <w:rPr>
-          <w:b/>
-        </w:rPr>
-        <w:t xml:space="preserve">Vanishing gradient.</w:t>
+        <w:t>When both hit_gamma_v and hit_gamma_h are set, the optimizer uses hit-line mode: instead of constraining the terminal point to the exact target (which may be infeasible with limited a_max), it constrains the terminal point to lie anywhere along the approach line through the target.</w:t>
       </w:r>
     </w:p>
     <w:p>
       <w:pPr>
-        <w:pStyle w:val="Normal"/>
+        <w:pStyle w:val="NoSpacing"/>
       </w:pPr>
       <w:r>
-        <w:rPr/>
-        <w:t xml:space="preserve">The smooth RangeOnLine uses a sigmoid with sharpness=20 rad^-1. When trajectory angles are &gt;20 degrees from target, the sigmoid compliance is &lt;0.005 and the cumulative product across 60 nodes is ~10^-228. The RangeOnLine gradient is effectively zero, leaving SLSQP with no signal to steer toward the target approach angle. Fix applied: added w_angle * (gV_N - hit_gV)^2 terminal angle penalty (new parameter, default=0.5) that has full gradient everywhere. RangeOnLine improved from 0 to 0.14 km.</w:t>
+        <w:t>Approach line direction vector:</w:t>
+        <w:br/>
+        <w:t xml:space="preserve">  d = (cos(gV_des)*cos(gH_des),  cos(gV_des)*sin(gH_des),  sin(gV_des))</w:t>
+        <w:br/>
+        <w:br/>
+        <w:t>Terminal position constraint (s is a free NLP variable):</w:t>
+        <w:br/>
+        <w:t xml:space="preserve">  x_f = x_target + s*d_x</w:t>
+        <w:br/>
+        <w:t xml:space="preserve">  y_f = y_target + s*d_y</w:t>
+        <w:br/>
+        <w:t xml:space="preserve">  h_f = z_target + s*d_z</w:t>
+        <w:br/>
+        <w:br/>
+        <w:t>Terminal angle constraints (hard inequalities):</w:t>
+        <w:br/>
+        <w:t xml:space="preserve">  |gV_f - gV_des| &lt;= angle_tol_deg</w:t>
+        <w:br/>
+        <w:t xml:space="preserve">  cos(gH_f - gH_des) &gt;= cos(angle_tol_deg)   (handles +/-180 deg wrap)</w:t>
       </w:r>
     </w:p>
     <w:p>
-      <w:pPr>
-        <w:pStyle w:val="Normal"/>
-      </w:pPr>
+      <w:pPr/>
       <w:r>
-        <w:rPr>
-          <w:b/>
-        </w:rPr>
-        <w:t xml:space="preserve">Model-reality mismatch.</w:t>
+        <w:t>The signed offset s (hit_line_offset_m) measures how far along the approach line the vehicle lands from the nominal target. A non-zero offset means the vehicle arrives with exactly the correct angle but not at the exact target point — this is a physics feasibility limit, not a solver bug.</w:t>
       </w:r>
     </w:p>
     <w:p>
       <w:pPr>
-        <w:pStyle w:val="Normal"/>
+        <w:pStyle w:val="Heading2"/>
       </w:pPr>
       <w:r>
-        <w:rPr/>
-        <w:t xml:space="preserve">SLSQP "solved" the Euler collocation at dt_coll=0.6 s, but when the schedule was re-simulated at dt=0.2 s, position drifted 700 m. Hermite-Simpson (4th-order) used in collocate.py eliminates this gap.</w:t>
+        <w:t>16.3  Merit Function</w:t>
       </w:r>
     </w:p>
     <w:p>
-      <w:pPr>
-        <w:pStyle w:val="Normal"/>
-      </w:pPr>
-      <w:r>
-        <w:rPr>
-          <w:b/>
-        </w:rPr>
-        <w:t xml:space="preserve">Scale.</w:t>
-      </w:r>
-    </w:p>
-    <w:p>
-      <w:pPr>
-        <w:pStyle w:val="Normal"/>
-      </w:pPr>
-      <w:r>
-        <w:rPr/>
-        <w:t xml:space="preserve">641 variables, 483 equality constraints, finite-difference Jacobians. SLSQP hit iteration limit on every run for the angled case.</w:t>
-      </w:r>
-    </w:p>
-    <w:p>
-      <w:pPr>
-        <w:pStyle w:val="Heading 2"/>
-      </w:pPr>
-      <w:r>
-        <w:rPr/>
-        <w:t xml:space="preserve">16.3  Merit Function — Hit-Line Mode</w:t>
-      </w:r>
-    </w:p>
-    <w:p>
-      <w:pPr>
-        <w:pStyle w:val="Normal"/>
-      </w:pPr>
-      <w:r>
-        <w:t>When both hit_gamma_v and hit_gamma_h are set, collocation_solve() uses the hit-line formulation. The merit function uses softplus-based penalties for control effort and miss distance:</w:t>
-      </w:r>
-    </w:p>
-    <w:p>
-      <w:pPr>
-        <w:pStyle w:val="Normal"/>
-      </w:pPr>
+      <w:pPr/>
       <w:r>
         <w:t>J = w_ctrl * ctrl_effort(pct_mean)   +   w_miss * miss_merit(miss_m)   +   w_time * T_f</w:t>
       </w:r>
     </w:p>
     <w:p>
       <w:pPr>
-        <w:pStyle w:val="Normal"/>
+        <w:pStyle w:val="NoSpacing"/>
       </w:pPr>
       <w:r>
-        <w:t>Control effort penalty (pct_mean = mean of |u_k|/a_max(v_k) * 100% across all nodes):</w:t>
+        <w:t>Control effort — softplus-based mean percentage of lateral limiter usage:</w:t>
+        <w:br/>
+        <w:t xml:space="preserve">  pct_k    = |u_k| / a_max(v_k) * 100    (% of limit at node k)</w:t>
+        <w:br/>
+        <w:t xml:space="preserve">  pct_mean = mean(pct_k) over all N1+1 + N2+1 nodes</w:t>
+        <w:br/>
+        <w:t xml:space="preserve">  ctrl_effort(p) = a1*(softplus(p - 50) - log2)  +  a2*softplus(1.5*(p - 90))</w:t>
+        <w:br/>
+        <w:t xml:space="preserve">  Shape: ~0 for p &lt; 50%, ~100 at p = 80%, ~901 at p = 95%, ~1668 at p = 100%.</w:t>
       </w:r>
     </w:p>
     <w:p>
       <w:pPr>
-        <w:pStyle w:val="Normal"/>
+        <w:pStyle w:val="NoSpacing"/>
       </w:pPr>
       <w:r>
-        <w:t xml:space="preserve">  ctrl_effort(p) = a1*(softplus(p - 50) - log2)  +  a2*softplus(1.5*(p - 90))</w:t>
+        <w:t>Miss distance — softplus with dead zone (default deadzone = 100 m):</w:t>
+        <w:br/>
+        <w:t xml:space="preserve">  miss_merit(m) = scale * (softplus(m - deadzone) - log2)</w:t>
+        <w:br/>
+        <w:t xml:space="preserve">  ~0 below the dead zone, ~50 at deadzone + 400 m.</w:t>
       </w:r>
     </w:p>
     <w:p>
-      <w:pPr>
-        <w:pStyle w:val="Normal"/>
-      </w:pPr>
+      <w:pPr/>
       <w:r>
-        <w:t xml:space="preserve">  Shape: ~0 for p&lt;50%, ~100 at p=80%, ~901 at p=95%, ~1668 at p=100%.</w:t>
+        <w:t>In hit-line mode miss_merit is small (the terminal point is on the approach line) and ctrl_effort drives the optimizer to use as little control as possible while satisfying the angle hard constraints.</w:t>
       </w:r>
     </w:p>
     <w:p>
-      <w:pPr>
-        <w:pStyle w:val="Normal"/>
-      </w:pPr>
+      <w:pPr/>
       <w:r>
-        <w:t>Miss distance penalty (dead zone = miss_deadzone, default 100 m):</w:t>
+        <w:rPr>
+          <w:b/>
+        </w:rPr>
+        <w:t>Figure — Control effort merit curve:</w:t>
       </w:r>
     </w:p>
     <w:p>
       <w:pPr>
-        <w:pStyle w:val="Normal"/>
+        <w:jc w:val="center"/>
       </w:pPr>
       <w:r>
-        <w:t xml:space="preserve">  miss_merit(m) = scale * (softplus(m - deadzone) - log2)   [~0 below deadzone, ~50 at deadzone+400m]</w:t>
+        <w:drawing>
+          <wp:inline xmlns:a="http://schemas.openxmlformats.org/drawingml/2006/main" xmlns:pic="http://schemas.openxmlformats.org/drawingml/2006/picture">
+            <wp:extent cx="5029200" cy="2828621"/>
+            <wp:docPr id="7" name="Picture 7"/>
+            <wp:cNvGraphicFramePr>
+              <a:graphicFrameLocks noChangeAspect="1"/>
+            </wp:cNvGraphicFramePr>
+            <a:graphic>
+              <a:graphicData uri="http://schemas.openxmlformats.org/drawingml/2006/picture">
+                <pic:pic>
+                  <pic:nvPicPr>
+                    <pic:cNvPr id="0" name="docs_fig_merit.png"/>
+                    <pic:cNvPicPr/>
+                  </pic:nvPicPr>
+                  <pic:blipFill>
+                    <a:blip r:embed="rId15"/>
+                    <a:stretch>
+                      <a:fillRect/>
+                    </a:stretch>
+                  </pic:blipFill>
+                  <pic:spPr>
+                    <a:xfrm>
+                      <a:off x="0" y="0"/>
+                      <a:ext cx="5029200" cy="2828621"/>
+                    </a:xfrm>
+                    <a:prstGeom prst="rect"/>
+                  </pic:spPr>
+                </pic:pic>
+              </a:graphicData>
+            </a:graphic>
+          </wp:inline>
+        </w:drawing>
       </w:r>
     </w:p>
     <w:p>
-      <w:pPr>
-        <w:pStyle w:val="Normal"/>
-      </w:pPr>
+      <w:pPr/>
       <w:r>
-        <w:t>Hard constraints (unchanged):</w:t>
+        <w:t>Figure 1 — ctrl_effort penalty vs mean control usage. Dead zone to 50%, soft increase to 80%, steep penalty above 95%.</w:t>
       </w:r>
     </w:p>
     <w:p>
       <w:pPr>
-        <w:pStyle w:val="Heading 2"/>
+        <w:pStyle w:val="Heading2"/>
       </w:pPr>
       <w:r>
-        <w:rPr/>
-        <w:t xml:space="preserve">16.4  Public API</w:t>
+        <w:t>16.4  Warm Start</w:t>
       </w:r>
     </w:p>
     <w:p>
-      <w:pPr>
-        <w:pStyle w:val="Normal"/>
-      </w:pPr>
+      <w:pPr/>
       <w:r>
-        <w:rPr/>
-        <w:t xml:space="preserve">from sim.collocate import collocation_solve, plot_collocated</w:t>
+        <w:t>Before calling IPOPT, an unconstrained IACPN reference simulation is run (hit_gamma_v=None, hit_gamma_h=None). Its state and command trajectory is interpolated onto the collocation nodes to provide a near-feasible initial guess. Using the angle-constrained IACPN as warm start produces a chaotic reference trajectory that causes IPOPT to diverge — always use the unconstrained version.</w:t>
       </w:r>
     </w:p>
     <w:p>
       <w:pPr>
-        <w:pStyle w:val="Normal"/>
+        <w:pStyle w:val="Heading2"/>
       </w:pPr>
       <w:r>
-        <w:rPr/>
-        <w:t xml:space="preserve">result = collocation_solve(params, N1=15, N2=30, angle_tol_deg=5.0, w_ctrl=1.0, w_time=1e-3)</w:t>
+        <w:t>16.5  Public API</w:t>
       </w:r>
     </w:p>
     <w:p>
       <w:pPr>
-        <w:pStyle w:val="Normal"/>
+        <w:pStyle w:val="NoSpacing"/>
       </w:pPr>
       <w:r>
-        <w:rPr/>
-        <w:t xml:space="preserve">Parameters:</w:t>
+        <w:t>from sim.collocate import collocation_solve, plot_collocated</w:t>
+        <w:br/>
+        <w:br/>
+        <w:t>result = collocation_solve(</w:t>
+        <w:br/>
+        <w:t xml:space="preserve">    params,                  # Params dataclass</w:t>
+        <w:br/>
+        <w:t xml:space="preserve">    N1=15,                   # segments in powered phase</w:t>
+        <w:br/>
+        <w:t xml:space="preserve">    N2=30,                   # segments in coast phase</w:t>
+        <w:br/>
+        <w:t xml:space="preserve">    angle_tol_deg=5.0,       # hard angle tolerance (deg) for gV and gH</w:t>
+        <w:br/>
+        <w:t xml:space="preserve">    w_ctrl=1.0,              # weight on ctrl_effort term</w:t>
+        <w:br/>
+        <w:t xml:space="preserve">    w_miss=0.0,              # weight on miss_merit term (0 in hit-line mode)</w:t>
+        <w:br/>
+        <w:t xml:space="preserve">    w_time=1e-3,             # weight on flight time</w:t>
+        <w:br/>
+        <w:t xml:space="preserve">    miss_deadzone=100.0,     # miss dead zone (m)</w:t>
+        <w:br/>
+        <w:t xml:space="preserve">    tf_guess=None,           # initial T_f guess (s); auto from IACPN if None</w:t>
+        <w:br/>
+        <w:t xml:space="preserve">    ipopt_opts=None,         # extra IPOPT options dict</w:t>
+        <w:br/>
+        <w:t>)</w:t>
       </w:r>
     </w:p>
     <w:p>
-      <w:pPr>
-        <w:pStyle w:val="Normal"/>
-      </w:pPr>
+      <w:pPr/>
       <w:r>
-        <w:rPr/>
-        <w:t xml:space="preserve">  params         — Params dataclass. hit_gamma_v and hit_gamma_h trigger hit-line mode.</w:t>
+        <w:t>Key result keys (result["summary"]):</w:t>
       </w:r>
     </w:p>
     <w:p>
       <w:pPr>
-        <w:pStyle w:val="Normal"/>
+        <w:pStyle w:val="NoSpacing"/>
       </w:pPr>
       <w:r>
-        <w:rPr/>
-        <w:t xml:space="preserve">  N1             — Hermite-Simpson segments in powered phase (default 15).</w:t>
+        <w:t xml:space="preserve">  solved            — True if IPOPT found an optimal solution</w:t>
+        <w:br/>
+        <w:t xml:space="preserve">  angle_satisfied   — True if both gV and gH errors &lt;= angle_tol_deg</w:t>
+        <w:br/>
+        <w:t xml:space="preserve">  miss_m            — Euclidean distance from terminal point to target (m)</w:t>
+        <w:br/>
+        <w:t xml:space="preserve">  hit_line_offset_m — Signed offset along approach line (m); 0 = exact target</w:t>
+        <w:br/>
+        <w:t xml:space="preserve">  gamma_v_err_deg   — Impact gV error (deg)</w:t>
+        <w:br/>
+        <w:t xml:space="preserve">  gamma_h_err_deg   — Impact gH error (deg)</w:t>
+        <w:br/>
+        <w:t xml:space="preserve">  flight_time_s     — Total flight time (s)</w:t>
+        <w:br/>
+        <w:t xml:space="preserve">  burnout_time_s    — Engine burnout time (s)</w:t>
       </w:r>
     </w:p>
     <w:p>
       <w:pPr>
-        <w:pStyle w:val="Normal"/>
+        <w:pStyle w:val="Heading2"/>
       </w:pPr>
       <w:r>
-        <w:rPr/>
-        <w:t xml:space="preserve">  N2             — Hermite-Simpson segments in coast phase (default 30).</w:t>
+        <w:t>16.6  Demo Results</w:t>
       </w:r>
     </w:p>
     <w:p>
       <w:pPr>
-        <w:pStyle w:val="Normal"/>
+        <w:pStyle w:val="NoSpacing"/>
       </w:pPr>
       <w:r>
-        <w:rPr/>
-        <w:t xml:space="preserve">  angle_tol_deg  — Hard angle tolerance for both gV and gH (default 5.0 deg).</w:t>
+        <w:t>Vehicle: m_pay=50 kg, m_prop=495 kg, m_str=50 kg, Isp=260 s, F=31 kN, burn_max=20 s</w:t>
+        <w:br/>
+        <w:t>Aero: Cd=0.4 (powered), Cd=1.2 (coast), CL=0, diam=0.5 m, ISA atmosphere</w:t>
+        <w:br/>
+        <w:t>Launch: angle=45 deg, azimuth=45 deg (NE)</w:t>
+        <w:br/>
+        <w:t>Target: (10, 10, 0) km  |  a_max=3g  |  gV_des=-45 deg  |  gH_des=45 deg</w:t>
+        <w:br/>
+        <w:t>Solver: N1=15, N2=30 segments, angle_tol=5 deg, w_ctrl=1.0, w_time=1e-3</w:t>
       </w:r>
     </w:p>
     <w:p>
       <w:pPr>
-        <w:pStyle w:val="Normal"/>
+        <w:pStyle w:val="NoSpacing"/>
       </w:pPr>
       <w:r>
-        <w:rPr/>
-        <w:t xml:space="preserve">  w_ctrl         — Weight on normalised control effort (default 1.0).</w:t>
+        <w:t>Collocation result:</w:t>
+        <w:br/>
+        <w:t xml:space="preserve">  solved:              True</w:t>
+        <w:br/>
+        <w:t xml:space="preserve">  angle_satisfied:     True</w:t>
+        <w:br/>
+        <w:t xml:space="preserve">  miss_m:              38.6 m  (on approach line, not at exact target)</w:t>
+        <w:br/>
+        <w:t xml:space="preserve">  hit_line_offset_m:  -38.6 m  (physics limit — 3g cannot reach exact -45 deg at 10 km)</w:t>
+        <w:br/>
+        <w:t xml:space="preserve">  gamma_v_err:         5.0 deg  (at tolerance boundary)</w:t>
+        <w:br/>
+        <w:t xml:space="preserve">  gamma_h_err:         0.4 deg  (near perfect)</w:t>
+        <w:br/>
+        <w:t xml:space="preserve">  flight_time_s:       46.2 s</w:t>
+        <w:br/>
+        <w:br/>
+        <w:t>IACPN reference (same params, no angle optimization):</w:t>
+        <w:br/>
+        <w:t xml:space="preserve">  miss_m:              242.8 m</w:t>
       </w:r>
     </w:p>
     <w:p>
-      <w:pPr>
-        <w:pStyle w:val="Normal"/>
-      </w:pPr>
+      <w:pPr/>
       <w:r>
-        <w:rPr/>
-        <w:t xml:space="preserve">  w_time         — Weight on flight time (default 1e-3).</w:t>
+        <w:t>The 38.6 m offset is a physics feasibility limit: with 3g lateral acceleration and this vehicle/range, the booster can approach at -45 deg flight-path angle but lands 38.6 m short of the exact target along the approach line. This is working as designed.</w:t>
       </w:r>
     </w:p>
     <w:p>
-      <w:pPr>
-        <w:pStyle w:val="Normal"/>
-      </w:pPr>
+      <w:pPr/>
       <w:r>
-        <w:rPr/>
-        <w:t xml:space="preserve">  ipopt_opts     — Dict of extra IPOPT options (e.g. ipopt.print_level).</w:t>
+        <w:rPr>
+          <w:b/>
+        </w:rPr>
+        <w:t>Figure — Direct collocation trajectory (4 panels):</w:t>
       </w:r>
     </w:p>
     <w:p>
       <w:pPr>
-        <w:pStyle w:val="Normal"/>
+        <w:jc w:val="center"/>
       </w:pPr>
       <w:r>
-        <w:rPr/>
-        <w:t xml:space="preserve">Key result summary keys:</w:t>
+        <w:drawing>
+          <wp:inline xmlns:a="http://schemas.openxmlformats.org/drawingml/2006/main" xmlns:pic="http://schemas.openxmlformats.org/drawingml/2006/picture">
+            <wp:extent cx="5486400" cy="3742684"/>
+            <wp:docPr id="8" name="Picture 8"/>
+            <wp:cNvGraphicFramePr>
+              <a:graphicFrameLocks noChangeAspect="1"/>
+            </wp:cNvGraphicFramePr>
+            <a:graphic>
+              <a:graphicData uri="http://schemas.openxmlformats.org/drawingml/2006/picture">
+                <pic:pic>
+                  <pic:nvPicPr>
+                    <pic:cNvPr id="0" name="docs_fig_collocate.png"/>
+                    <pic:cNvPicPr/>
+                  </pic:nvPicPr>
+                  <pic:blipFill>
+                    <a:blip r:embed="rId16"/>
+                    <a:stretch>
+                      <a:fillRect/>
+                    </a:stretch>
+                  </pic:blipFill>
+                  <pic:spPr>
+                    <a:xfrm>
+                      <a:off x="0" y="0"/>
+                      <a:ext cx="5486400" cy="3742684"/>
+                    </a:xfrm>
+                    <a:prstGeom prst="rect"/>
+                  </pic:spPr>
+                </pic:pic>
+              </a:graphicData>
+            </a:graphic>
+          </wp:inline>
+        </w:drawing>
       </w:r>
     </w:p>
     <w:p>
-      <w:pPr>
-        <w:pStyle w:val="Normal"/>
-      </w:pPr>
+      <w:pPr/>
       <w:r>
-        <w:rPr/>
-        <w:t xml:space="preserve">  solved            — True if IPOPT converged.</w:t>
+        <w:t>Figure 2 — Direct collocation result vs IACPN reference. Top-left: ground track (N-E plane). Top-right: altitude vs time. Bottom-left: pitch command a_nV at collocation nodes. Bottom-right: yaw command a_nH at collocation nodes.</w:t>
       </w:r>
     </w:p>
     <w:p>
-      <w:pPr>
-        <w:pStyle w:val="Normal"/>
-      </w:pPr>
+      <w:pPr/>
       <w:r>
-        <w:rPr/>
-        <w:t xml:space="preserve">  miss_m            — Euclidean distance from terminal point to nominal target (m).</w:t>
+        <w:rPr>
+          <w:b/>
+        </w:rPr>
+        <w:t>Figure — IACPN guidance comparison:</w:t>
       </w:r>
     </w:p>
     <w:p>
       <w:pPr>
-        <w:pStyle w:val="Normal"/>
+        <w:jc w:val="center"/>
       </w:pPr>
       <w:r>
-        <w:rPr/>
-        <w:t xml:space="preserve">  hit_line_offset_m — Signed offset along approach line (m). 0 = exact target.</w:t>
+        <w:drawing>
+          <wp:inline xmlns:a="http://schemas.openxmlformats.org/drawingml/2006/main" xmlns:pic="http://schemas.openxmlformats.org/drawingml/2006/picture">
+            <wp:extent cx="5486400" cy="2278303"/>
+            <wp:docPr id="9" name="Picture 9"/>
+            <wp:cNvGraphicFramePr>
+              <a:graphicFrameLocks noChangeAspect="1"/>
+            </wp:cNvGraphicFramePr>
+            <a:graphic>
+              <a:graphicData uri="http://schemas.openxmlformats.org/drawingml/2006/picture">
+                <pic:pic>
+                  <pic:nvPicPr>
+                    <pic:cNvPr id="0" name="docs_fig_iacpn.png"/>
+                    <pic:cNvPicPr/>
+                  </pic:nvPicPr>
+                  <pic:blipFill>
+                    <a:blip r:embed="rId17"/>
+                    <a:stretch>
+                      <a:fillRect/>
+                    </a:stretch>
+                  </pic:blipFill>
+                  <pic:spPr>
+                    <a:xfrm>
+                      <a:off x="0" y="0"/>
+                      <a:ext cx="5486400" cy="2278303"/>
+                    </a:xfrm>
+                    <a:prstGeom prst="rect"/>
+                  </pic:spPr>
+                </pic:pic>
+              </a:graphicData>
+            </a:graphic>
+          </wp:inline>
+        </w:drawing>
       </w:r>
     </w:p>
     <w:p>
-      <w:pPr>
-        <w:pStyle w:val="Normal"/>
-      </w:pPr>
+      <w:pPr/>
       <w:r>
-        <w:rPr/>
-        <w:t xml:space="preserve">  gamma_v_err_deg   — Impact gV error (deg).</w:t>
+        <w:t>Figure 3 — IACPN guidance comparison: ballistic (black dashed), pure PN (blue), IACPN gV=-45 deg (green), IACPN gV=-70 deg (red). Left: altitude vs downrange. Right: flight-path angle vs time.</w:t>
       </w:r>
     </w:p>
     <w:p>
       <w:pPr>
-        <w:pStyle w:val="Normal"/>
+        <w:pStyle w:val="Heading2"/>
       </w:pPr>
       <w:r>
-        <w:rPr/>
-        <w:t xml:space="preserve">  gamma_h_err_deg   — Impact gH error (deg).</w:t>
+        <w:t>16.7  Bugs Fixed in collocate.py (v3.1)</w:t>
       </w:r>
     </w:p>
     <w:p>
-      <w:pPr>
-        <w:pStyle w:val="Normal"/>
-      </w:pPr>
+      <w:pPr/>
       <w:r>
-        <w:rPr/>
-        <w:t xml:space="preserve">  angle_satisfied   — True if both angle constraints satisfied.</w:t>
+        <w:t>Bug 1 — Angle-constrained warm start: using angle-constrained IACPN for the initial guess produced a chaotic reference trajectory that caused IPOPT to diverge. Fix: always use unconstrained IACPN (hit_gamma_v=None, hit_gamma_h=None) for the warm start.</w:t>
       </w:r>
     </w:p>
     <w:p>
-      <w:pPr>
-        <w:pStyle w:val="Heading 2"/>
-      </w:pPr>
+      <w:pPr/>
       <w:r>
-        <w:rPr/>
-        <w:t xml:space="preserve">16.5  Demo Result</w:t>
+        <w:t>Bug 2 — Missing state bounds: no bounds on gV or gH at intermediate nodes allowed IPOPT to drive flight-path angles to +-1000 deg (numerically valid via sin/cos but physically meaningless). Fix: gV bounded to [-pi/2, pi/2], gH bounded to launch_azimuth +/- 210 deg at every node.</w:t>
       </w:r>
     </w:p>
     <w:p>
-      <w:pPr>
-        <w:pStyle w:val="Normal"/>
-      </w:pPr>
+      <w:pPr/>
       <w:r>
-        <w:rPr/>
-        <w:t xml:space="preserve">Demo params (m_pay=50, m_prop=495, target=(10,10,0) km, a_lat_max=3g, hit_gamma_v=-45 deg, hit_gamma_h=45 deg, angle_tol=5 deg):</w:t>
+        <w:t>Bug 3 — v=0 singularity at launch: angle-rate equations contain dgV = g*cos(gV)/v which diverges at v=0. Fix: clamp v to max(v, grav_turn_v_min) in angle-rate denominators only (the dv/dt equation for thrust/drag uses raw v).</w:t>
       </w:r>
     </w:p>
     <w:p>
       <w:pPr>
-        <w:pStyle w:val="Normal"/>
+        <w:pStyle w:val="Heading2"/>
       </w:pPr>
       <w:r>
-        <w:rPr/>
-        <w:t xml:space="preserve">  solved:              True</w:t>
+        <w:t>16.8  Prerequisites</w:t>
       </w:r>
     </w:p>
     <w:p>
-      <w:pPr>
-        <w:pStyle w:val="Normal"/>
-      </w:pPr>
+      <w:pPr/>
       <w:r>
-        <w:rPr/>
-        <w:t xml:space="preserve">  hit_line_offset:    -0.47 km  (physics limit — 3g cannot achieve exactly -45 deg at 10 km)</w:t>
-      </w:r>
-    </w:p>
-    <w:p>
-      <w:pPr>
-        <w:pStyle w:val="Normal"/>
-      </w:pPr>
-      <w:r>
-        <w:rPr/>
-        <w:t xml:space="preserve">  gamma_v_err:         5.0 deg  (at tolerance boundary — optimizer is working correctly)</w:t>
-      </w:r>
-    </w:p>
-    <w:p>
-      <w:pPr>
-        <w:pStyle w:val="Normal"/>
-      </w:pPr>
-      <w:r>
-        <w:rPr/>
-        <w:t xml:space="preserve">  gamma_h_err:         0.0 deg  (perfect)</w:t>
-      </w:r>
-    </w:p>
-    <w:p>
-      <w:pPr>
-        <w:pStyle w:val="Normal"/>
-      </w:pPr>
-      <w:r>
-        <w:rPr/>
-        <w:t xml:space="preserve">  angle_satisfied:     True</w:t>
-      </w:r>
-    </w:p>
-    <w:p>
-      <w:pPr>
-        <w:pStyle w:val="Normal"/>
-      </w:pPr>
-      <w:r>
-        <w:rPr/>
-        <w:t xml:space="preserve">The 470 m hit-line offset is a physics constraint, not a solver bug: with 3g lateral acceleration, the vehicle can approach at ~40 deg (5 deg off the desired 45 deg) but cannot achieve exactly -45 deg while also reaching the exact ground target at 10 km range. Increasing a_lat_max reduces this offset.</w:t>
-      </w:r>
-    </w:p>
-    <w:p>
-      <w:pPr>
-        <w:pStyle w:val="Normal"/>
-      </w:pPr>
-      <w:r>
-        <w:rPr/>
-        <w:t xml:space="preserve">Prerequisite: pip install casadi  (CasADi 3.7+ with bundled IPOPT).</w:t>
-      </w:r>
-    </w:p>
-    <w:p>
-      <w:pPr>
-        <w:pStyle w:val="Heading2"/>
-      </w:pPr>
-      <w:r>
-        <w:t>v3.2 — Bug fix: simulation stop condition for below-ground targets (April 14, 2026)</w:t>
-      </w:r>
-    </w:p>
-    <w:p>
-      <w:r>
-        <w:t>Bug: simulate.py terminated when h &lt;= 0 regardless of z_target. For targets below ground level (z_target &lt; 0), the simulation stopped at h=0 instead of continuing to the target altitude.</w:t>
-      </w:r>
-    </w:p>
-    <w:p>
-      <w:r>
-        <w:t>Fix (sim/simulate.py): changed stop condition from h &lt;= 0 to h &lt;= min(0, z_target_m). Ground-level targets (z_target=0) behave identically. Below-ground targets now correctly continue past h=0 until the target altitude is reached. All 15 check vectors pass.</w:t>
-      </w:r>
-    </w:p>
-    <w:p>
-      <w:pPr>
-        <w:pStyle w:val="Heading2"/>
-      </w:pPr>
-      <w:r>
-        <w:t>v3.2 — Improved simulation termination for backwards trajectories (April 14, 2026)</w:t>
-      </w:r>
-    </w:p>
-    <w:p>
-      <w:r>
-        <w:t>The simulation termination logic was redesigned to support backwards trajectories (where the booster overshoots the target and curves back). Three stop conditions now apply (in addition to the _MAX_STEPS safety limit):</w:t>
-      </w:r>
-    </w:p>
-    <w:p>
-      <w:pPr>
-        <w:pStyle w:val="ListBullet"/>
-      </w:pPr>
-      <w:r>
-        <w:t>(1) 3-D proximity &lt; 100 m — armed after vehicle moves &gt; 500 m from target. Primary stop for on-target approaches and backwards loop-back trajectories.</w:t>
-      </w:r>
-    </w:p>
-    <w:p>
-      <w:pPr>
-        <w:pStyle w:val="ListBullet"/>
-      </w:pPr>
-      <w:r>
-        <w:t>(2) Altitude floor — h &lt;= z_target_m, gated by vehicle having first climbed &gt; 50 m above z_target. Catches vehicles that miss horizontally and hit ground.</w:t>
-      </w:r>
-    </w:p>
-    <w:p>
-      <w:pPr>
-        <w:pStyle w:val="ListBullet"/>
-      </w:pPr>
-      <w:r>
-        <w:t>(3) Stalled post-burnout — v &lt; v_min_stop (new Params field, default None = disabled). Stops a vehicle that can no longer reach the target.</w:t>
-      </w:r>
-    </w:p>
-    <w:p>
-      <w:r>
-        <w:t>The old passed_above_target boolean and hard-coded h&lt;=0 floor are removed. All 15 check vectors pass unchanged.</w:t>
+        <w:t>pip install casadi    # CasADi 3.7+ with bundled IPOPT</w:t>
       </w:r>
     </w:p>
     <w:p>

</xml_diff>

<commit_message>
remove a_cmd_t: tangential acceleration has no physical actuator
Tangential acceleration along the velocity vector is governed entirely
by engine thrust, drag, and gravity — there is no independent actuator
that can command speed. The a_cmd_t parameter was a modelling artefact
added for symmetry with a_cmd_nv/a_cmd_nh but never used (always 0.0).

Removed from: physics.py (Params + EOM comment + integrate_step),
collocate.py (_f_powered + _f_coast), opt_trajectory.py, run.py,
simulation.ipynb cell 4, and Word doc (EOM equation + section 5.6).

All 15 check vectors pass.

Co-Authored-By: Claude Sonnet 4.6 <noreply@anthropic.com>
</commit_message>
<xml_diff>
--- a/files/Booster_Impact_Simulation_Documentation.docx
+++ b/files/Booster_Impact_Simulation_Documentation.docx
@@ -1200,11 +1200,7 @@
         <w:ind w:left="567"/>
       </w:pPr>
       <w:r>
-        <w:rPr>
-          <w:rFonts w:ascii="Courier New" w:hAnsi="Courier New"/>
-          <w:sz w:val="19"/>
-        </w:rPr>
-        <w:t>m · (dv/dt) = T_t − D − m·g·sin(γV) + m·a_t_cmd</w:t>
+        <w:t>m · (dv/dt) = T_t - D - m·g·sin(gV)</w:t>
       </w:r>
     </w:p>
     <w:p>
@@ -1600,7 +1596,7 @@
         <w:spacing w:after="80"/>
       </w:pPr>
       <w:r>
-        <w:t>Three constant commanded accelerations can be applied throughout the flight to simulate guidance corrections or lateral manoeuvres:</w:t>
+        <w:t>Two constant commanded accelerations can be applied throughout the flight to simulate lateral guidance corrections or crossrange corrections: a_nV_cmd (pitch-normal, ê_nV) and a_nH_cmd (yaw-normal, ê_nH).</w:t>
       </w:r>
     </w:p>
     <w:tbl>
@@ -1981,7 +1977,7 @@
         <w:spacing w:after="80"/>
       </w:pPr>
       <w:r>
-        <w:t>In the equations of motion the commanded accelerations appear as additional body-force terms: a_t_cmd enters the dv/dt equation directly; a_nV_cmd contributes a_nV_cmd/v to dγV/dt; a_nH_cmd contributes a_nH_cmd / (v·cos(γV)) to dγH/dt.</w:t>
+        <w:t>In the equations of motion the commanded accelerations appear as additional body-force terms: a_nV_cmd enters the dgV/dt equation; a_nH_cmd enters the dgH/dt equation. There is no independent tangential command — tangential acceleration is governed entirely by engine thrust, drag, and gravity.</w:t>
       </w:r>
     </w:p>
     <w:p>
@@ -4752,7 +4748,7 @@
         <w:spacing w:after="40"/>
       </w:pPr>
       <w:r>
-        <w:t>7. Evaluate the three velocity-frame ODEs: dv/dt, dγV/dt, dγH/dt (with command augmentations).</w:t>
+        <w:t>7. Evaluate the three velocity-frame ODEs: dv/dt, dgV/dt, dgH/dt. a_nV and a_nH commands augment the pitch and yaw equations respectively.</w:t>
       </w:r>
     </w:p>
     <w:p>

</xml_diff>

<commit_message>
refactor: unify merit function to single four-component formula
collocate.py:
- Remove split hit-line / point-target merit branches
- Single objective: J = w_ctrl·ControlEffortMerit + w_miss·MissMerit
  + w_time·FlightTimeMerit + w_final_line·FinalLineMerit
- MissMerit input: |s|² (hit-line) or miss_m² (point-target)
- w_miss default: None → auto 0.0 hit-line / 1.0 point-target
- Remove w_miss_soft, miss_deadzone, w_angle_v, w_angle_h params
- Terminal constraints (hit-line) remain separate from merit

docs/section 16.3: replace two-mode formula with unified four-component formula
docs/section 16.5: update API params to match new signature

Co-Authored-By: Claude Sonnet 4.6 <noreply@anthropic.com>
</commit_message>
<xml_diff>
--- a/files/Booster_Impact_Simulation_Documentation.docx
+++ b/files/Booster_Impact_Simulation_Documentation.docx
@@ -6797,49 +6797,47 @@
           <w:rFonts w:ascii="Courier New" w:hAnsi="Courier New"/>
           <w:sz w:val="18"/>
         </w:rPr>
-        <w:t>Hit-line mode  (both hit_gamma_v AND hit_gamma_h set):</w:t>
+        <w:t>J = w_ctrl       · ControlEffortMerit(pct_mean)</w:t>
         <w:br/>
-        <w:t xml:space="preserve">  J = w_ctrl · ctrl_effort(pct_mean)</w:t>
+        <w:t xml:space="preserve">  + w_miss       · MissMerit(miss_m²)</w:t>
         <w:br/>
-        <w:t xml:space="preserve">    + w_final_line · pen(FL_smooth)</w:t>
+        <w:t xml:space="preserve">  + w_time       · FlightTimeMerit(T_f)</w:t>
         <w:br/>
-        <w:t xml:space="preserve">    + w_time · T_f</w:t>
+        <w:t xml:space="preserve">  + w_final_line · FinalLineMerit(FL_smooth)</w:t>
         <w:br/>
         <w:br/>
-        <w:t>Point-target mode  (fallback when angles absent):</w:t>
+        <w:t>ControlEffortMerit — softplus penalty on mean control usage (% of limit):</w:t>
         <w:br/>
-        <w:t xml:space="preserve">  J = w_miss · miss_m²  +  w_angle_v · γV_err²  +  w_angle_h · γH_err²</w:t>
+        <w:t xml:space="preserve">  pct_k    = |u_k| / a_max(v_k) * 100</w:t>
         <w:br/>
-        <w:t xml:space="preserve">    + w_time · T_f</w:t>
-        <w:br/>
-        <w:br/>
-        <w:t>Control effort — softplus-based mean percentage of lateral limiter usage:</w:t>
-        <w:br/>
-        <w:t xml:space="preserve">  pct_k    = |u_k| / a_max(v_k) * 100    (% of limit at node k)</w:t>
-        <w:br/>
-        <w:t xml:space="preserve">  pct_mean = mean(pct_k)  over all N1+1 + N2+1 nodes</w:t>
+        <w:t xml:space="preserve">  pct_mean = mean over all N1+1 + N2+1 nodes</w:t>
         <w:br/>
         <w:t xml:space="preserve">  ctrl_effort = a1·(softplus(pct−50)−log2) + a2·softplus(β2·(pct−90))</w:t>
         <w:br/>
-        <w:t xml:space="preserve">  Calibrated: dead zone to 50%, penalty ≈ 100 at 80%, steep above 95%.</w:t>
+        <w:t xml:space="preserve">  Dead zone to 50%, ≈100 at 80%, steep above 95%.</w:t>
         <w:br/>
         <w:br/>
-        <w:t>FinalLine penalty — quartic ReLU on smooth FL proxy (hit-line mode only):</w:t>
+        <w:t>MissMerit — squared miss distance m²:</w:t>
         <w:br/>
-        <w:t xml:space="preserve">  pen(FL_smooth) = A · max(0, D − FL_smooth)⁴</w:t>
+        <w:t xml:space="preserve">  Hit-line mode  → miss_m = |s|  (offset along approach line)</w:t>
         <w:br/>
-        <w:t xml:space="preserve">  A = 50,  D = final_line_deadzone_km (default 1.0 km).</w:t>
+        <w:t xml:space="preserve">  Point-target   → miss_m = ‖pos_f − pos_target‖</w:t>
         <w:br/>
-        <w:t xml:space="preserve">  FL ≥ D → zero penalty.  FL = D−1 km → penalty 50.  FL = D−1.5 km → 253.</w:t>
-        <w:br/>
-        <w:t xml:space="preserve">  See section 16.9 for the full FinalLine metric definition.</w:t>
+        <w:t xml:space="preserve">  Default w_miss = 0.0 hit-line (position free on line), 1.0 point-target.</w:t>
         <w:br/>
         <w:br/>
-        <w:t>Miss distance — softplus with dead zone (point-target / soft-miss option):</w:t>
+        <w:t>FlightTimeMerit — total flight time T_f (seconds).</w:t>
         <w:br/>
-        <w:t xml:space="preserve">  miss_merit(m) = scale · (softplus(m − deadzone) − log2)</w:t>
         <w:br/>
-        <w:t xml:space="preserve">  Exact zero below the dead zone.  ≈ 50 at deadzone + 400 m.</w:t>
+        <w:t>FinalLineMerit — quartic-ReLU penalty on FinalLine smooth proxy:</w:t>
+        <w:br/>
+        <w:t xml:space="preserve">  pen(FL_smooth) = 50 · max(0, D − FL_smooth)⁴,  D = final_line_deadzone_km</w:t>
+        <w:br/>
+        <w:t xml:space="preserve">  FL ≥ D → zero penalty; FL = D−1 km → 50; FL = D−1.5 km → ≈253.</w:t>
+        <w:br/>
+        <w:t xml:space="preserve">  Active only in hit-line mode (set w_final_line=0 to disable).</w:t>
+        <w:br/>
+        <w:t xml:space="preserve">  See section 16.9 for FinalLine metric and proxy definition.</w:t>
       </w:r>
     </w:p>
     <w:p>
@@ -6863,17 +6861,7 @@
         <w:pStyle w:val="NoSpacing"/>
       </w:pPr>
       <w:r>
-        <w:t>Miss distance — softplus with dead zone (default deadzone = 100 m):</w:t>
-        <w:br/>
-        <w:t xml:space="preserve">  miss_merit(m) = scale * (softplus(m - deadzone) - log2)</w:t>
-        <w:br/>
-        <w:t xml:space="preserve">  ~0 below the dead zone, ~50 at deadzone + 400 m.</w:t>
-      </w:r>
-    </w:p>
-    <w:p>
-      <w:pPr/>
-      <w:r>
-        <w:t>In hit-line mode miss_merit is small (the terminal point is on the approach line) and ctrl_effort drives the optimizer to use as little control as possible while satisfying the angle hard constraints.</w:t>
+        <w:t>In hit-line mode w_miss defaults to 0.0 (vehicle free to land anywhere on the approach line). Set w_miss &gt; 0 to additionally pull toward the nominal target point. In point-target mode w_miss=1.0 drives the solution to the exact target; FinalLineMerit is inactive (w_final_line effectively 0).</w:t>
       </w:r>
     </w:p>
     <w:p>
@@ -6966,53 +6954,41 @@
         <w:br/>
         <w:t>result = collocation_solve(</w:t>
         <w:br/>
-        <w:t xml:space="preserve">    params,                  # Params — vehicle + target</w:t>
+        <w:t xml:space="preserve">    params,                    # Params — vehicle + target</w:t>
         <w:br/>
-        <w:t xml:space="preserve">    N1           = 15,       # Hermite-Simpson segments, powered phase</w:t>
+        <w:t xml:space="preserve">    N1                 = 15,   # Hermite-Simpson segments, powered phase</w:t>
         <w:br/>
-        <w:t xml:space="preserve">    N2           = 30,       # Hermite-Simpson segments, coast phase</w:t>
+        <w:t xml:space="preserve">    N2                 = 30,   # Hermite-Simpson segments, coast phase</w:t>
         <w:br/>
-        <w:t xml:space="preserve">    # ── Hit-line mode (active when both hit_gamma_v and hit_gamma_h set) ──</w:t>
+        <w:t xml:space="preserve">    # ── Terminal constraints (hit-line mode when both angles set) ─────</w:t>
         <w:br/>
-        <w:t xml:space="preserve">    angle_tol_deg          = 5.0,   # hard angle tolerance at terminal node (deg)</w:t>
+        <w:t xml:space="preserve">    angle_tol_deg      = 5.0,  # hard angle tolerance at terminal node (deg)</w:t>
         <w:br/>
-        <w:t xml:space="preserve">    hit_line_range_max     = 50.0,  # max |s| offset along hit line (km)</w:t>
+        <w:t xml:space="preserve">    hit_line_range_max = 50.0, # max |s| offset along hit line (km)</w:t>
         <w:br/>
-        <w:t xml:space="preserve">    w_ctrl                 = 1.0,   # weight on ctrl_effort</w:t>
+        <w:t xml:space="preserve">    # ── Four merit weights ───────────────────────────────────────────</w:t>
         <w:br/>
-        <w:t xml:space="preserve">    w_time                 = 1e-3,  # weight on total flight time</w:t>
+        <w:t xml:space="preserve">    w_ctrl             = 1.0,  # ControlEffortMerit</w:t>
         <w:br/>
-        <w:t xml:space="preserve">    # ── FinalLine approach-alignment penalty (hit-line mode) ─────────────</w:t>
+        <w:t xml:space="preserve">    w_miss             = None, # MissMerit  (auto: 0.0 hit-line, 1.0 point-target)</w:t>
         <w:br/>
-        <w:t xml:space="preserve">    w_final_line           = 0.1,   # weight on FinalLine quartic-ReLU penalty</w:t>
+        <w:t xml:space="preserve">    w_time             = 1e-3, # FlightTimeMerit</w:t>
         <w:br/>
-        <w:t xml:space="preserve">    final_line_tol_deg     = 3.0,   # angle tolerance for FinalLine (deg)</w:t>
+        <w:t xml:space="preserve">    w_final_line       = 0.1,  # FinalLineMerit  (0 = disabled)</w:t>
         <w:br/>
-        <w:t xml:space="preserve">    final_line_nodes       = 10,    # terminal coast nodes in smooth proxy</w:t>
+        <w:t xml:space="preserve">    # ── FinalLine options ────────────────────────────────────────────</w:t>
         <w:br/>
-        <w:t xml:space="preserve">    final_line_deadzone_km = 1.0,   # FL above this → zero penalty (km)</w:t>
+        <w:t xml:space="preserve">    final_line_tol_deg     = 3.0,  # angle tolerance for FinalLine (deg)</w:t>
         <w:br/>
-        <w:t xml:space="preserve">    # ── Point-target fallback ─────────────────────────────────────────────</w:t>
+        <w:t xml:space="preserve">    final_line_nodes       = 10,   # terminal coast nodes in smooth proxy</w:t>
         <w:br/>
-        <w:t xml:space="preserve">    w_miss      = 1.0,   w_angle_v = 0.01,   w_angle_h = 0.01,</w:t>
+        <w:t xml:space="preserve">    final_line_deadzone_km = 1.0,  # FL above this → zero penalty (km)</w:t>
         <w:br/>
-        <w:t xml:space="preserve">    # ── Soft miss penalty (both modes, disabled by default) ───────────────</w:t>
-        <w:br/>
-        <w:t xml:space="preserve">    w_miss_soft = 0.0,   miss_deadzone = 100.0,   # m</w:t>
-        <w:br/>
-        <w:t xml:space="preserve">    # ── Solver ───────────────────────────────────────────────────────────</w:t>
-        <w:br/>
-        <w:t xml:space="preserve">    warm_start  = 'iacpn',   # 'iacpn' or 'linear'</w:t>
+        <w:t xml:space="preserve">    warm_start  = 'iacpn',  # 'iacpn' or 'linear'</w:t>
         <w:br/>
         <w:t xml:space="preserve">    ipopt_opts  = None,</w:t>
         <w:br/>
         <w:t>)</w:t>
-      </w:r>
-    </w:p>
-    <w:p>
-      <w:pPr/>
-      <w:r>
-        <w:t>Key result keys (result["summary"]):</w:t>
       </w:r>
     </w:p>
     <w:p>

</xml_diff>

<commit_message>
docs: add MissMerit figure to section 16.3
Two-panel figure (Figure 2) inserted after ctrl_effort curve:
- Left: MissMerit = miss_m² vs miss distance (0–2 km, w_miss=1.0)
- Right: gradient ∂J/∂miss = 2·miss_m — linear growth gives IPOPT
  a smooth, strong signal at all miss distances

Co-Authored-By: Claude Sonnet 4.6 <noreply@anthropic.com>
</commit_message>
<xml_diff>
--- a/files/Booster_Impact_Simulation_Documentation.docx
+++ b/files/Booster_Impact_Simulation_Documentation.docx
@@ -6916,6 +6916,61 @@
       <w:pPr/>
       <w:r>
         <w:t>Figure 1 — ctrl_effort penalty vs mean control usage. Dead zone to 50%, soft increase to 80%, steep penalty above 95%.</w:t>
+      </w:r>
+    </w:p>
+    <w:p>
+      <w:r>
+        <w:rPr>
+          <w:b w:val="0"/>
+        </w:rPr>
+        <w:t>Figure — MissMerit penalty curve:</w:t>
+      </w:r>
+    </w:p>
+    <w:p>
+      <w:pPr>
+        <w:jc w:val="center"/>
+      </w:pPr>
+      <w:r>
+        <w:drawing>
+          <wp:inline xmlns:a="http://schemas.openxmlformats.org/drawingml/2006/main" xmlns:pic="http://schemas.openxmlformats.org/drawingml/2006/picture">
+            <wp:extent cx="5303520" cy="2002614"/>
+            <wp:docPr id="11" name="Picture 11"/>
+            <wp:cNvGraphicFramePr>
+              <a:graphicFrameLocks noChangeAspect="1"/>
+            </wp:cNvGraphicFramePr>
+            <a:graphic>
+              <a:graphicData uri="http://schemas.openxmlformats.org/drawingml/2006/picture">
+                <pic:pic>
+                  <pic:nvPicPr>
+                    <pic:cNvPr id="0" name="_fig_miss_merit.png"/>
+                    <pic:cNvPicPr/>
+                  </pic:nvPicPr>
+                  <pic:blipFill>
+                    <a:blip r:embed="rId19"/>
+                    <a:stretch>
+                      <a:fillRect/>
+                    </a:stretch>
+                  </pic:blipFill>
+                  <pic:spPr>
+                    <a:xfrm>
+                      <a:off x="0" y="0"/>
+                      <a:ext cx="5303520" cy="2002614"/>
+                    </a:xfrm>
+                    <a:prstGeom prst="rect"/>
+                  </pic:spPr>
+                </pic:pic>
+              </a:graphicData>
+            </a:graphic>
+          </wp:inline>
+        </w:drawing>
+      </w:r>
+    </w:p>
+    <w:p>
+      <w:r>
+        <w:rPr>
+          <w:b w:val="0"/>
+        </w:rPr>
+        <w:t>Figure 2 — MissMerit = miss_m² vs miss distance (w_miss = 1.0, point-target mode). Left: quadratic penalty grows from 0 at zero miss to 4×10⁶ m² at 2 km. Right: gradient ∂J/∂miss = 2·miss_m — the pull toward the target grows linearly, giving IPOPT a strong, smooth signal at all miss distances. In hit-line mode w_miss defaults to 0.0 (no miss penalty; position is free on the approach line).</w:t>
       </w:r>
     </w:p>
     <w:p>

</xml_diff>

<commit_message>
docs: replace stale Figure 1 with fresh collocate.py result
Old figure used infeasible params (20km target, SLSQP v3.0, 0 solved).
New figure: 10km target, γV=-45°, γH=45°, a_lat_max=3g
  quality_ok=True, miss=0.28m, γV_err=-0.19°, γH_err=-0.03°, FinalLine=2.26km

Also updated intro text to match current demo params.

Figures 3/4 (optimizer grid) still use opt_trajectory.py (secondary) — pending replacement.

Co-Authored-By: Claude Sonnet 4.6 <noreply@anthropic.com>
</commit_message>
<xml_diff>
--- a/files/Booster_Impact_Simulation_Documentation.docx
+++ b/files/Booster_Impact_Simulation_Documentation.docx
@@ -7542,7 +7542,7 @@
     </w:p>
     <w:p>
       <w:r>
-        <w:t>The following plots were generated using the demo parameters: m_pay=50 kg, m_prop=495 kg, m_str=50 kg, Isp=260 s, thrust=31 kN, burn_max=20 s, cd=0.4, diam=0.5 m, launch_angle=45°, launch_azimuth=45°, x_target=10 km, y_target=10 km, a_lat_max=3.0 g.</w:t>
+        <w:t>The following plots were generated using the demo parameters: m_pay=50 kg, m_prop=495 kg, m_str=50 kg, Isp=260 s, thrust=31 kN, burn_max=20 s, Cd=0.4 (powered) / 1.2 (coast), diam=0.5 m, launch_angle=45°, launch_azimuth=45°, x_target=10 km, y_target=10 km, a_lat_max=3 g.</w:t>
       </w:r>
     </w:p>
     <w:p>
@@ -7552,8 +7552,8 @@
       <w:r>
         <w:drawing>
           <wp:inline xmlns:a="http://schemas.openxmlformats.org/drawingml/2006/main" xmlns:pic="http://schemas.openxmlformats.org/drawingml/2006/picture">
-            <wp:extent cx="5669280" cy="3896784"/>
-            <wp:docPr id="4" name="Picture 4"/>
+            <wp:extent cx="5303520" cy="3510906"/>
+            <wp:docPr id="12" name="Picture 12"/>
             <wp:cNvGraphicFramePr>
               <a:graphicFrameLocks noChangeAspect="1"/>
             </wp:cNvGraphicFramePr>
@@ -7561,11 +7561,11 @@
               <a:graphicData uri="http://schemas.openxmlformats.org/drawingml/2006/picture">
                 <pic:pic>
                   <pic:nvPicPr>
-                    <pic:cNvPr id="0" name="fig1_optimizer.png"/>
+                    <pic:cNvPr id="0" name="_demo_result.png"/>
                     <pic:cNvPicPr/>
                   </pic:nvPicPr>
                   <pic:blipFill>
-                    <a:blip r:embed="rId12"/>
+                    <a:blip r:embed="rId20"/>
                     <a:stretch>
                       <a:fillRect/>
                     </a:stretch>
@@ -7573,7 +7573,7 @@
                   <pic:spPr>
                     <a:xfrm>
                       <a:off x="0" y="0"/>
-                      <a:ext cx="5669280" cy="3896784"/>
+                      <a:ext cx="5303520" cy="3510906"/>
                     </a:xfrm>
                     <a:prstGeom prst="rect"/>
                   </pic:spPr>
@@ -7589,7 +7589,7 @@
         <w:jc w:val="center"/>
       </w:pPr>
       <w:r>
-        <w:t>Figure 1 — Direct-collocation trajectory optimiser (v3.0): (20 km N, 20 km E) target, γV=−45°, γH=45°. Nominal IACPN miss: 19564 m → optimised miss: 23618.44 m  (solved: False). RangeOnLine: 0.00 km. Flight time: 12000.0 s.</w:t>
+        <w:t>Figure 1 — Direct collocation (collocate.py, Hermite-Simpson + IPOPT): 10 km target (N=10, E=10), γV=−45°, γH=45°, a_lat_max=3 g. quality_ok=True, miss=0.28 m, hit_line_offset=−0.28 m, γV_err=−0.19°, γH_err=−0.03°, FinalLine=2.26 km, flight_time=55.8 s. IACPN reference miss=0.9 m (dashed). Top-left: ground track. Top-right: altitude vs time. Bottom: pitch (a_nV) and yaw (a_nH) commands, powered phase (solid) and coast phase (dashed).</w:t>
       </w:r>
     </w:p>
     <w:p/>

</xml_diff>

<commit_message>
docs: replace stale grid Figures 3/4 with fresh collocate.py results
Old figures used opt_trajectory.py (SLSQP secondary, 0/6 solved) with
infeasible 20-25 km targets. New figures use collocate.py (Hermite-Simpson
+ IPOPT) with reachable on-axis targets.

Figure 3 (angle_tol=5°): 3 targets × 2 angles → 5/6 quality_ok
Figure 4 (angle_tol=3°): same grid, tighter tolerance → 2/6 quality_ok
  (shows that 3g vehicle struggles to meet ≤3° constraint at off-axis targets)

Targets: (10,10), (9,11), (11,9) km  |  Angles: γV=-45°/-30°, γH=45°
Vehicle: m_pay=50, m_prop=495, a_lat_max=3g (same demo params)

Co-Authored-By: Claude Sonnet 4.6 <noreply@anthropic.com>
</commit_message>
<xml_diff>
--- a/files/Booster_Impact_Simulation_Documentation.docx
+++ b/files/Booster_Impact_Simulation_Documentation.docx
@@ -7928,7 +7928,7 @@
     </w:p>
     <w:p>
       <w:r>
-        <w:t>The following plots were generated by running optimize_trajectory() for each cell in the hit_points × hit_angles Cartesian product using the demo vehicle parameters.</w:t>
+        <w:t>The following plots were generated by running collocation_solve() (collocate.py, Hermite-Simpson + IPOPT) for each cell in the hit_points × hit_angles grid. Vehicle: m_pay=50 kg, m_prop=495 kg, a_lat_max=3 g (demo params).</w:t>
       </w:r>
     </w:p>
     <w:p>
@@ -7938,8 +7938,8 @@
       <w:r>
         <w:drawing>
           <wp:inline xmlns:a="http://schemas.openxmlformats.org/drawingml/2006/main" xmlns:pic="http://schemas.openxmlformats.org/drawingml/2006/picture">
-            <wp:extent cx="5669280" cy="3752056"/>
-            <wp:docPr id="5" name="Picture 5"/>
+            <wp:extent cx="5303520" cy="2132371"/>
+            <wp:docPr id="13" name="Picture 13"/>
             <wp:cNvGraphicFramePr>
               <a:graphicFrameLocks noChangeAspect="1"/>
             </wp:cNvGraphicFramePr>
@@ -7947,11 +7947,11 @@
               <a:graphicData uri="http://schemas.openxmlformats.org/drawingml/2006/picture">
                 <pic:pic>
                   <pic:nvPicPr>
-                    <pic:cNvPr id="0" name="fig_grid_opt_noangle.png"/>
+                    <pic:cNvPr id="0" name="_fig3_new.png"/>
                     <pic:cNvPicPr/>
                   </pic:nvPicPr>
                   <pic:blipFill>
-                    <a:blip r:embed="rId13"/>
+                    <a:blip r:embed="rId21"/>
                     <a:stretch>
                       <a:fillRect/>
                     </a:stretch>
@@ -7959,7 +7959,7 @@
                   <pic:spPr>
                     <a:xfrm>
                       <a:off x="0" y="0"/>
-                      <a:ext cx="5669280" cy="3752056"/>
+                      <a:ext cx="5303520" cy="2132371"/>
                     </a:xfrm>
                     <a:prstGeom prst="rect"/>
                   </pic:spPr>
@@ -7972,7 +7972,7 @@
     </w:p>
     <w:p>
       <w:r>
-        <w:t>Figure 3 — Optimizer grid (v3.0, direct collocation, RangeOnLine merit). Three target points: (20,20,0), (0,25,0), (25,5,0) km × two angle cases (γV=−45° with γH=45°; γV=−45° unconstrained). 0/6 runs solved (miss &lt; 1 m). Green bars = solved, red = not solved.</w:t>
+        <w:t>Figure 3 — collocate.py optimizer grid (Hermite-Simpson + IPOPT, angle_tol=5°). Three targets: (10,10), (9,11), (11,9) km × two approach angles: γV=−45° and γV=−30°, both γH=45°. Vehicle: a_lat_max=3 g, same demo params as Figure 1. 5/6 runs quality_ok (miss &lt; 200 m, angles within tolerance). Green = quality_ok=True, red = quality_ok=False. ΔγV/ΔγH annotations show terminal angle errors.</w:t>
       </w:r>
     </w:p>
     <w:p>
@@ -7982,8 +7982,8 @@
       <w:r>
         <w:drawing>
           <wp:inline xmlns:a="http://schemas.openxmlformats.org/drawingml/2006/main" xmlns:pic="http://schemas.openxmlformats.org/drawingml/2006/picture">
-            <wp:extent cx="5669280" cy="3752056"/>
-            <wp:docPr id="6" name="Picture 6"/>
+            <wp:extent cx="5303520" cy="2132371"/>
+            <wp:docPr id="14" name="Picture 14"/>
             <wp:cNvGraphicFramePr>
               <a:graphicFrameLocks noChangeAspect="1"/>
             </wp:cNvGraphicFramePr>
@@ -7991,11 +7991,11 @@
               <a:graphicData uri="http://schemas.openxmlformats.org/drawingml/2006/picture">
                 <pic:pic>
                   <pic:nvPicPr>
-                    <pic:cNvPr id="0" name="fig_grid_opt_angle.png"/>
+                    <pic:cNvPr id="0" name="_fig4_new.png"/>
                     <pic:cNvPicPr/>
                   </pic:nvPicPr>
                   <pic:blipFill>
-                    <a:blip r:embed="rId14"/>
+                    <a:blip r:embed="rId22"/>
                     <a:stretch>
                       <a:fillRect/>
                     </a:stretch>
@@ -8003,7 +8003,7 @@
                   <pic:spPr>
                     <a:xfrm>
                       <a:off x="0" y="0"/>
-                      <a:ext cx="5669280" cy="3752056"/>
+                      <a:ext cx="5303520" cy="2132371"/>
                     </a:xfrm>
                     <a:prstGeom prst="rect"/>
                   </pic:spPr>
@@ -8016,7 +8016,7 @@
     </w:p>
     <w:p>
       <w:r>
-        <w:t>Figure 4 — Optimizer grid (v3.0), tighter tolerance angle_tol_deg=3°. Same targets and angle cases as Figure 3. 0/6 runs solved. ΔγV labels show residual impact angle error.</w:t>
+        <w:t>Figure 4 — collocate.py optimizer grid with tighter terminal constraint angle_tol=3°. Same targets and angle cases as Figure 3. 2/6 runs quality_ok — the tighter constraint is harder to satisfy with a 3 g vehicle: achieving both the correct approach angle and a short FinalLine requires more lateral authority.</w:t>
       </w:r>
     </w:p>
     <w:p>

</xml_diff>